<commit_message>
Update team contribution file
Updated my part
</commit_message>
<xml_diff>
--- a/docs/phase2/team-contribution.docx
+++ b/docs/phase2/team-contribution.docx
@@ -1,6 +1,6 @@
 
 <file path=word/document.xml><?xml version="1.0" encoding="utf-8"?>
-<w:document xmlns:wpc="http://schemas.microsoft.com/office/word/2010/wordprocessingCanvas" xmlns:cx="http://schemas.microsoft.com/office/drawing/2014/chartex" xmlns:cx1="http://schemas.microsoft.com/office/drawing/2015/9/8/chartex" xmlns:cx2="http://schemas.microsoft.com/office/drawing/2015/10/21/chartex" xmlns:cx3="http://schemas.microsoft.com/office/drawing/2016/5/9/chartex" xmlns:cx4="http://schemas.microsoft.com/office/drawing/2016/5/10/chartex" xmlns:cx5="http://schemas.microsoft.com/office/drawing/2016/5/11/chartex" xmlns:cx6="http://schemas.microsoft.com/office/drawing/2016/5/12/chartex" xmlns:cx7="http://schemas.microsoft.com/office/drawing/2016/5/13/chartex" xmlns:cx8="http://schemas.microsoft.com/office/drawing/2016/5/14/chartex" xmlns:mc="http://schemas.openxmlformats.org/markup-compatibility/2006" xmlns:aink="http://schemas.microsoft.com/office/drawing/2016/ink" xmlns:am3d="http://schemas.microsoft.com/office/drawing/2017/model3d" xmlns:o="urn:schemas-microsoft-com:office:office" xmlns:oel="http://schemas.microsoft.com/office/2019/extlst" xmlns:r="http://schemas.openxmlformats.org/officeDocument/2006/relationships" xmlns:m="http://schemas.openxmlformats.org/officeDocument/2006/math" xmlns:v="urn:schemas-microsoft-com:vml" xmlns:wp14="http://schemas.microsoft.com/office/word/2010/wordprocessingDrawing" xmlns:wp="http://schemas.openxmlformats.org/drawingml/2006/wordprocessingDrawing" xmlns:w10="urn:schemas-microsoft-com:office:word" xmlns:w="http://schemas.openxmlformats.org/wordprocessingml/2006/main" xmlns:w14="http://schemas.microsoft.com/office/word/2010/wordml" xmlns:w15="http://schemas.microsoft.com/office/word/2012/wordml" xmlns:w16cex="http://schemas.microsoft.com/office/word/2018/wordml/cex" xmlns:w16cid="http://schemas.microsoft.com/office/word/2016/wordml/cid" xmlns:w16="http://schemas.microsoft.com/office/word/2018/wordml" xmlns:w16du="http://schemas.microsoft.com/office/word/2023/wordml/word16du" xmlns:w16sdtdh="http://schemas.microsoft.com/office/word/2020/wordml/sdtdatahash" xmlns:w16se="http://schemas.microsoft.com/office/word/2015/wordml/symex" xmlns:wpg="http://schemas.microsoft.com/office/word/2010/wordprocessingGroup" xmlns:wpi="http://schemas.microsoft.com/office/word/2010/wordprocessingInk" xmlns:wne="http://schemas.microsoft.com/office/word/2006/wordml" xmlns:wps="http://schemas.microsoft.com/office/word/2010/wordprocessingShape" mc:Ignorable="w14 w15 w16se w16cid w16 w16cex w16sdtdh w16du wp14">
+<w:document xmlns:wpc="http://schemas.microsoft.com/office/word/2010/wordprocessingCanvas" xmlns:cx="http://schemas.microsoft.com/office/drawing/2014/chartex" xmlns:cx1="http://schemas.microsoft.com/office/drawing/2015/9/8/chartex" xmlns:cx2="http://schemas.microsoft.com/office/drawing/2015/10/21/chartex" xmlns:cx3="http://schemas.microsoft.com/office/drawing/2016/5/9/chartex" xmlns:cx4="http://schemas.microsoft.com/office/drawing/2016/5/10/chartex" xmlns:cx5="http://schemas.microsoft.com/office/drawing/2016/5/11/chartex" xmlns:cx6="http://schemas.microsoft.com/office/drawing/2016/5/12/chartex" xmlns:cx7="http://schemas.microsoft.com/office/drawing/2016/5/13/chartex" xmlns:cx8="http://schemas.microsoft.com/office/drawing/2016/5/14/chartex" xmlns:mc="http://schemas.openxmlformats.org/markup-compatibility/2006" xmlns:aink="http://schemas.microsoft.com/office/drawing/2016/ink" xmlns:am3d="http://schemas.microsoft.com/office/drawing/2017/model3d" xmlns:o="urn:schemas-microsoft-com:office:office" xmlns:oel="http://schemas.microsoft.com/office/2019/extlst" xmlns:r="http://schemas.openxmlformats.org/officeDocument/2006/relationships" xmlns:m="http://schemas.openxmlformats.org/officeDocument/2006/math" xmlns:v="urn:schemas-microsoft-com:vml" xmlns:wp14="http://schemas.microsoft.com/office/word/2010/wordprocessingDrawing" xmlns:wp="http://schemas.openxmlformats.org/drawingml/2006/wordprocessingDrawing" xmlns:w10="urn:schemas-microsoft-com:office:word" xmlns:w="http://schemas.openxmlformats.org/wordprocessingml/2006/main" xmlns:w14="http://schemas.microsoft.com/office/word/2010/wordml" xmlns:w15="http://schemas.microsoft.com/office/word/2012/wordml" xmlns:w16cex="http://schemas.microsoft.com/office/word/2018/wordml/cex" xmlns:w16cid="http://schemas.microsoft.com/office/word/2016/wordml/cid" xmlns:w16="http://schemas.microsoft.com/office/word/2018/wordml" xmlns:w16du="http://schemas.microsoft.com/office/word/2023/wordml/word16du" xmlns:w16sdtdh="http://schemas.microsoft.com/office/word/2020/wordml/sdtdatahash" xmlns:w16sdtfl="http://schemas.microsoft.com/office/word/2024/wordml/sdtformatlock" xmlns:w16se="http://schemas.microsoft.com/office/word/2015/wordml/symex" xmlns:wpg="http://schemas.microsoft.com/office/word/2010/wordprocessingGroup" xmlns:wpi="http://schemas.microsoft.com/office/word/2010/wordprocessingInk" xmlns:wne="http://schemas.microsoft.com/office/word/2006/wordml" xmlns:wps="http://schemas.microsoft.com/office/word/2010/wordprocessingShape" mc:Ignorable="w14 w15 w16se w16cid w16 w16cex w16sdtdh w16sdtfl w16du wp14">
   <w:body>
     <w:p>
       <w:pPr>
@@ -40,16 +40,6 @@
           <w14:ligatures w14:val="none"/>
         </w:rPr>
         <w:tab/>
-      </w:r>
-      <w:r>
-        <w:rPr>
-          <w:rFonts w:ascii="Times New Roman" w:eastAsia="Times New Roman" w:hAnsi="Times New Roman" w:cs="Times New Roman"/>
-          <w:b/>
-          <w:bCs/>
-          <w:color w:val="0F1115"/>
-          <w:kern w:val="0"/>
-          <w14:ligatures w14:val="none"/>
-        </w:rPr>
         <w:t>Dollar Doodle:</w:t>
       </w:r>
     </w:p>
@@ -238,6 +228,15 @@
         </w:rPr>
         <w:t>:</w:t>
       </w:r>
+      <w:r>
+        <w:rPr>
+          <w:rFonts w:ascii="Times New Roman" w:eastAsia="Times New Roman" w:hAnsi="Times New Roman" w:cs="Times New Roman"/>
+          <w:color w:val="0F1115"/>
+          <w:kern w:val="0"/>
+          <w14:ligatures w14:val="none"/>
+        </w:rPr>
+        <w:t xml:space="preserve"> Creating original SQL and ERD for DB</w:t>
+      </w:r>
     </w:p>
     <w:p>
       <w:pPr>
@@ -253,6 +252,7 @@
           <w14:ligatures w14:val="none"/>
         </w:rPr>
       </w:pPr>
+      <w:proofErr w:type="spellStart"/>
       <w:r>
         <w:rPr>
           <w:rFonts w:ascii="Times New Roman" w:eastAsia="Times New Roman" w:hAnsi="Times New Roman" w:cs="Times New Roman"/>
@@ -262,7 +262,19 @@
           <w:kern w:val="0"/>
           <w14:ligatures w14:val="none"/>
         </w:rPr>
-        <w:t>Roumaysae Jerari</w:t>
+        <w:t>Roumaysae</w:t>
+      </w:r>
+      <w:proofErr w:type="spellEnd"/>
+      <w:r>
+        <w:rPr>
+          <w:rFonts w:ascii="Times New Roman" w:eastAsia="Times New Roman" w:hAnsi="Times New Roman" w:cs="Times New Roman"/>
+          <w:b/>
+          <w:bCs/>
+          <w:color w:val="0F1115"/>
+          <w:kern w:val="0"/>
+          <w14:ligatures w14:val="none"/>
+        </w:rPr>
+        <w:t xml:space="preserve"> Jerari</w:t>
       </w:r>
       <w:r>
         <w:rPr>
@@ -365,7 +377,7 @@
 </file>
 
 <file path=word/numbering.xml><?xml version="1.0" encoding="utf-8"?>
-<w:numbering xmlns:wpc="http://schemas.microsoft.com/office/word/2010/wordprocessingCanvas" xmlns:cx="http://schemas.microsoft.com/office/drawing/2014/chartex" xmlns:cx1="http://schemas.microsoft.com/office/drawing/2015/9/8/chartex" xmlns:cx2="http://schemas.microsoft.com/office/drawing/2015/10/21/chartex" xmlns:cx3="http://schemas.microsoft.com/office/drawing/2016/5/9/chartex" xmlns:cx4="http://schemas.microsoft.com/office/drawing/2016/5/10/chartex" xmlns:cx5="http://schemas.microsoft.com/office/drawing/2016/5/11/chartex" xmlns:cx6="http://schemas.microsoft.com/office/drawing/2016/5/12/chartex" xmlns:cx7="http://schemas.microsoft.com/office/drawing/2016/5/13/chartex" xmlns:cx8="http://schemas.microsoft.com/office/drawing/2016/5/14/chartex" xmlns:mc="http://schemas.openxmlformats.org/markup-compatibility/2006" xmlns:aink="http://schemas.microsoft.com/office/drawing/2016/ink" xmlns:am3d="http://schemas.microsoft.com/office/drawing/2017/model3d" xmlns:o="urn:schemas-microsoft-com:office:office" xmlns:oel="http://schemas.microsoft.com/office/2019/extlst" xmlns:r="http://schemas.openxmlformats.org/officeDocument/2006/relationships" xmlns:m="http://schemas.openxmlformats.org/officeDocument/2006/math" xmlns:v="urn:schemas-microsoft-com:vml" xmlns:wp14="http://schemas.microsoft.com/office/word/2010/wordprocessingDrawing" xmlns:wp="http://schemas.openxmlformats.org/drawingml/2006/wordprocessingDrawing" xmlns:w10="urn:schemas-microsoft-com:office:word" xmlns:w="http://schemas.openxmlformats.org/wordprocessingml/2006/main" xmlns:w14="http://schemas.microsoft.com/office/word/2010/wordml" xmlns:w15="http://schemas.microsoft.com/office/word/2012/wordml" xmlns:w16cex="http://schemas.microsoft.com/office/word/2018/wordml/cex" xmlns:w16cid="http://schemas.microsoft.com/office/word/2016/wordml/cid" xmlns:w16="http://schemas.microsoft.com/office/word/2018/wordml" xmlns:w16du="http://schemas.microsoft.com/office/word/2023/wordml/word16du" xmlns:w16sdtdh="http://schemas.microsoft.com/office/word/2020/wordml/sdtdatahash" xmlns:w16se="http://schemas.microsoft.com/office/word/2015/wordml/symex" xmlns:wpg="http://schemas.microsoft.com/office/word/2010/wordprocessingGroup" xmlns:wpi="http://schemas.microsoft.com/office/word/2010/wordprocessingInk" xmlns:wne="http://schemas.microsoft.com/office/word/2006/wordml" xmlns:wps="http://schemas.microsoft.com/office/word/2010/wordprocessingShape" mc:Ignorable="w14 w15 w16se w16cid w16 w16cex w16sdtdh w16du wp14">
+<w:numbering xmlns:wpc="http://schemas.microsoft.com/office/word/2010/wordprocessingCanvas" xmlns:cx="http://schemas.microsoft.com/office/drawing/2014/chartex" xmlns:cx1="http://schemas.microsoft.com/office/drawing/2015/9/8/chartex" xmlns:cx2="http://schemas.microsoft.com/office/drawing/2015/10/21/chartex" xmlns:cx3="http://schemas.microsoft.com/office/drawing/2016/5/9/chartex" xmlns:cx4="http://schemas.microsoft.com/office/drawing/2016/5/10/chartex" xmlns:cx5="http://schemas.microsoft.com/office/drawing/2016/5/11/chartex" xmlns:cx6="http://schemas.microsoft.com/office/drawing/2016/5/12/chartex" xmlns:cx7="http://schemas.microsoft.com/office/drawing/2016/5/13/chartex" xmlns:cx8="http://schemas.microsoft.com/office/drawing/2016/5/14/chartex" xmlns:mc="http://schemas.openxmlformats.org/markup-compatibility/2006" xmlns:aink="http://schemas.microsoft.com/office/drawing/2016/ink" xmlns:am3d="http://schemas.microsoft.com/office/drawing/2017/model3d" xmlns:o="urn:schemas-microsoft-com:office:office" xmlns:oel="http://schemas.microsoft.com/office/2019/extlst" xmlns:r="http://schemas.openxmlformats.org/officeDocument/2006/relationships" xmlns:m="http://schemas.openxmlformats.org/officeDocument/2006/math" xmlns:v="urn:schemas-microsoft-com:vml" xmlns:wp14="http://schemas.microsoft.com/office/word/2010/wordprocessingDrawing" xmlns:wp="http://schemas.openxmlformats.org/drawingml/2006/wordprocessingDrawing" xmlns:w10="urn:schemas-microsoft-com:office:word" xmlns:w="http://schemas.openxmlformats.org/wordprocessingml/2006/main" xmlns:w14="http://schemas.microsoft.com/office/word/2010/wordml" xmlns:w15="http://schemas.microsoft.com/office/word/2012/wordml" xmlns:w16cex="http://schemas.microsoft.com/office/word/2018/wordml/cex" xmlns:w16cid="http://schemas.microsoft.com/office/word/2016/wordml/cid" xmlns:w16="http://schemas.microsoft.com/office/word/2018/wordml" xmlns:w16du="http://schemas.microsoft.com/office/word/2023/wordml/word16du" xmlns:w16sdtdh="http://schemas.microsoft.com/office/word/2020/wordml/sdtdatahash" xmlns:w16sdtfl="http://schemas.microsoft.com/office/word/2024/wordml/sdtformatlock" xmlns:w16se="http://schemas.microsoft.com/office/word/2015/wordml/symex" xmlns:wpg="http://schemas.microsoft.com/office/word/2010/wordprocessingGroup" xmlns:wpi="http://schemas.microsoft.com/office/word/2010/wordprocessingInk" xmlns:wne="http://schemas.microsoft.com/office/word/2006/wordml" xmlns:wps="http://schemas.microsoft.com/office/word/2010/wordprocessingShape" mc:Ignorable="w14 w15 w16se w16cid w16 w16cex w16sdtdh w16sdtfl w16du wp14">
   <w:abstractNum w:abstractNumId="0" w15:restartNumberingAfterBreak="0">
     <w:nsid w:val="41F93453"/>
     <w:multiLevelType w:val="multilevel"/>
@@ -517,21 +529,12 @@
   </w:abstractNum>
   <w:num w:numId="1" w16cid:durableId="146675652">
     <w:abstractNumId w:val="0"/>
-    <w:lvlOverride w:ilvl="0"/>
-    <w:lvlOverride w:ilvl="1"/>
-    <w:lvlOverride w:ilvl="2"/>
-    <w:lvlOverride w:ilvl="3"/>
-    <w:lvlOverride w:ilvl="4"/>
-    <w:lvlOverride w:ilvl="5"/>
-    <w:lvlOverride w:ilvl="6"/>
-    <w:lvlOverride w:ilvl="7"/>
-    <w:lvlOverride w:ilvl="8"/>
   </w:num>
 </w:numbering>
 </file>
 
 <file path=word/styles.xml><?xml version="1.0" encoding="utf-8"?>
-<w:styles xmlns:mc="http://schemas.openxmlformats.org/markup-compatibility/2006" xmlns:r="http://schemas.openxmlformats.org/officeDocument/2006/relationships" xmlns:w="http://schemas.openxmlformats.org/wordprocessingml/2006/main" xmlns:w14="http://schemas.microsoft.com/office/word/2010/wordml" xmlns:w15="http://schemas.microsoft.com/office/word/2012/wordml" xmlns:w16cex="http://schemas.microsoft.com/office/word/2018/wordml/cex" xmlns:w16cid="http://schemas.microsoft.com/office/word/2016/wordml/cid" xmlns:w16="http://schemas.microsoft.com/office/word/2018/wordml" xmlns:w16du="http://schemas.microsoft.com/office/word/2023/wordml/word16du" xmlns:w16sdtdh="http://schemas.microsoft.com/office/word/2020/wordml/sdtdatahash" xmlns:w16se="http://schemas.microsoft.com/office/word/2015/wordml/symex" mc:Ignorable="w14 w15 w16se w16cid w16 w16cex w16sdtdh w16du">
+<w:styles xmlns:mc="http://schemas.openxmlformats.org/markup-compatibility/2006" xmlns:r="http://schemas.openxmlformats.org/officeDocument/2006/relationships" xmlns:w="http://schemas.openxmlformats.org/wordprocessingml/2006/main" xmlns:w14="http://schemas.microsoft.com/office/word/2010/wordml" xmlns:w15="http://schemas.microsoft.com/office/word/2012/wordml" xmlns:w16cex="http://schemas.microsoft.com/office/word/2018/wordml/cex" xmlns:w16cid="http://schemas.microsoft.com/office/word/2016/wordml/cid" xmlns:w16="http://schemas.microsoft.com/office/word/2018/wordml" xmlns:w16du="http://schemas.microsoft.com/office/word/2023/wordml/word16du" xmlns:w16sdtdh="http://schemas.microsoft.com/office/word/2020/wordml/sdtdatahash" xmlns:w16sdtfl="http://schemas.microsoft.com/office/word/2024/wordml/sdtformatlock" xmlns:w16se="http://schemas.microsoft.com/office/word/2015/wordml/symex" mc:Ignorable="w14 w15 w16se w16cid w16 w16cex w16sdtdh w16sdtfl w16du">
   <w:docDefaults>
     <w:rPrDefault>
       <w:rPr>

</xml_diff>

<commit_message>
Add my work contribution.
</commit_message>
<xml_diff>
--- a/docs/phase2/team-contribution.docx
+++ b/docs/phase2/team-contribution.docx
@@ -1,6 +1,6 @@
 
 <file path=word/document.xml><?xml version="1.0" encoding="utf-8"?>
-<w:document xmlns:wpc="http://schemas.microsoft.com/office/word/2010/wordprocessingCanvas" xmlns:cx="http://schemas.microsoft.com/office/drawing/2014/chartex" xmlns:cx1="http://schemas.microsoft.com/office/drawing/2015/9/8/chartex" xmlns:cx2="http://schemas.microsoft.com/office/drawing/2015/10/21/chartex" xmlns:cx3="http://schemas.microsoft.com/office/drawing/2016/5/9/chartex" xmlns:cx4="http://schemas.microsoft.com/office/drawing/2016/5/10/chartex" xmlns:cx5="http://schemas.microsoft.com/office/drawing/2016/5/11/chartex" xmlns:cx6="http://schemas.microsoft.com/office/drawing/2016/5/12/chartex" xmlns:cx7="http://schemas.microsoft.com/office/drawing/2016/5/13/chartex" xmlns:cx8="http://schemas.microsoft.com/office/drawing/2016/5/14/chartex" xmlns:mc="http://schemas.openxmlformats.org/markup-compatibility/2006" xmlns:aink="http://schemas.microsoft.com/office/drawing/2016/ink" xmlns:am3d="http://schemas.microsoft.com/office/drawing/2017/model3d" xmlns:o="urn:schemas-microsoft-com:office:office" xmlns:oel="http://schemas.microsoft.com/office/2019/extlst" xmlns:r="http://schemas.openxmlformats.org/officeDocument/2006/relationships" xmlns:m="http://schemas.openxmlformats.org/officeDocument/2006/math" xmlns:v="urn:schemas-microsoft-com:vml" xmlns:wp14="http://schemas.microsoft.com/office/word/2010/wordprocessingDrawing" xmlns:wp="http://schemas.openxmlformats.org/drawingml/2006/wordprocessingDrawing" xmlns:w10="urn:schemas-microsoft-com:office:word" xmlns:w="http://schemas.openxmlformats.org/wordprocessingml/2006/main" xmlns:w14="http://schemas.microsoft.com/office/word/2010/wordml" xmlns:w15="http://schemas.microsoft.com/office/word/2012/wordml" xmlns:w16cex="http://schemas.microsoft.com/office/word/2018/wordml/cex" xmlns:w16cid="http://schemas.microsoft.com/office/word/2016/wordml/cid" xmlns:w16="http://schemas.microsoft.com/office/word/2018/wordml" xmlns:w16du="http://schemas.microsoft.com/office/word/2023/wordml/word16du" xmlns:w16sdtdh="http://schemas.microsoft.com/office/word/2020/wordml/sdtdatahash" xmlns:w16sdtfl="http://schemas.microsoft.com/office/word/2024/wordml/sdtformatlock" xmlns:w16se="http://schemas.microsoft.com/office/word/2015/wordml/symex" xmlns:wpg="http://schemas.microsoft.com/office/word/2010/wordprocessingGroup" xmlns:wpi="http://schemas.microsoft.com/office/word/2010/wordprocessingInk" xmlns:wne="http://schemas.microsoft.com/office/word/2006/wordml" xmlns:wps="http://schemas.microsoft.com/office/word/2010/wordprocessingShape" mc:Ignorable="w14 w15 w16se w16cid w16 w16cex w16sdtdh w16sdtfl w16du wp14">
+<w:document xmlns:wpc="http://schemas.microsoft.com/office/word/2010/wordprocessingCanvas" xmlns:cx="http://schemas.microsoft.com/office/drawing/2014/chartex" xmlns:cx1="http://schemas.microsoft.com/office/drawing/2015/9/8/chartex" xmlns:cx2="http://schemas.microsoft.com/office/drawing/2015/10/21/chartex" xmlns:cx3="http://schemas.microsoft.com/office/drawing/2016/5/9/chartex" xmlns:cx4="http://schemas.microsoft.com/office/drawing/2016/5/10/chartex" xmlns:cx5="http://schemas.microsoft.com/office/drawing/2016/5/11/chartex" xmlns:cx6="http://schemas.microsoft.com/office/drawing/2016/5/12/chartex" xmlns:cx7="http://schemas.microsoft.com/office/drawing/2016/5/13/chartex" xmlns:cx8="http://schemas.microsoft.com/office/drawing/2016/5/14/chartex" xmlns:mc="http://schemas.openxmlformats.org/markup-compatibility/2006" xmlns:aink="http://schemas.microsoft.com/office/drawing/2016/ink" xmlns:am3d="http://schemas.microsoft.com/office/drawing/2017/model3d" xmlns:o="urn:schemas-microsoft-com:office:office" xmlns:oel="http://schemas.microsoft.com/office/2019/extlst" xmlns:r="http://schemas.openxmlformats.org/officeDocument/2006/relationships" xmlns:m="http://schemas.openxmlformats.org/officeDocument/2006/math" xmlns:v="urn:schemas-microsoft-com:vml" xmlns:wp14="http://schemas.microsoft.com/office/word/2010/wordprocessingDrawing" xmlns:wp="http://schemas.openxmlformats.org/drawingml/2006/wordprocessingDrawing" xmlns:w10="urn:schemas-microsoft-com:office:word" xmlns:w="http://schemas.openxmlformats.org/wordprocessingml/2006/main" xmlns:w14="http://schemas.microsoft.com/office/word/2010/wordml" xmlns:w15="http://schemas.microsoft.com/office/word/2012/wordml" xmlns:w16cex="http://schemas.microsoft.com/office/word/2018/wordml/cex" xmlns:w16cid="http://schemas.microsoft.com/office/word/2016/wordml/cid" xmlns:w16="http://schemas.microsoft.com/office/word/2018/wordml" xmlns:w16du="http://schemas.microsoft.com/office/word/2023/wordml/word16du" xmlns:w16sdtdh="http://schemas.microsoft.com/office/word/2020/wordml/sdtdatahash" xmlns:w16se="http://schemas.microsoft.com/office/word/2015/wordml/symex" xmlns:wpg="http://schemas.microsoft.com/office/word/2010/wordprocessingGroup" xmlns:wpi="http://schemas.microsoft.com/office/word/2010/wordprocessingInk" xmlns:wne="http://schemas.microsoft.com/office/word/2006/wordml" xmlns:wps="http://schemas.microsoft.com/office/word/2010/wordprocessingShape" mc:Ignorable="w14 w15 w16se w16cid w16 w16cex w16sdtdh w16du wp14">
   <w:body>
     <w:p>
       <w:pPr>
@@ -252,7 +252,6 @@
           <w14:ligatures w14:val="none"/>
         </w:rPr>
       </w:pPr>
-      <w:proofErr w:type="spellStart"/>
       <w:r>
         <w:rPr>
           <w:rFonts w:ascii="Times New Roman" w:eastAsia="Times New Roman" w:hAnsi="Times New Roman" w:cs="Times New Roman"/>
@@ -262,19 +261,7 @@
           <w:kern w:val="0"/>
           <w14:ligatures w14:val="none"/>
         </w:rPr>
-        <w:t>Roumaysae</w:t>
-      </w:r>
-      <w:proofErr w:type="spellEnd"/>
-      <w:r>
-        <w:rPr>
-          <w:rFonts w:ascii="Times New Roman" w:eastAsia="Times New Roman" w:hAnsi="Times New Roman" w:cs="Times New Roman"/>
-          <w:b/>
-          <w:bCs/>
-          <w:color w:val="0F1115"/>
-          <w:kern w:val="0"/>
-          <w14:ligatures w14:val="none"/>
-        </w:rPr>
-        <w:t xml:space="preserve"> Jerari</w:t>
+        <w:t>Roumaysae Jerari</w:t>
       </w:r>
       <w:r>
         <w:rPr>
@@ -285,6 +272,269 @@
         </w:rPr>
         <w:t>:</w:t>
       </w:r>
+    </w:p>
+    <w:p>
+      <w:pPr>
+        <w:pStyle w:val="ds-markdown-paragraph"/>
+        <w:numPr>
+          <w:ilvl w:val="0"/>
+          <w:numId w:val="4"/>
+        </w:numPr>
+        <w:shd w:val="clear" w:color="auto" w:fill="FFFFFF"/>
+        <w:spacing w:before="0" w:beforeAutospacing="0" w:after="0" w:afterAutospacing="0" w:line="420" w:lineRule="atLeast"/>
+        <w:rPr>
+          <w:rFonts w:ascii="Segoe UI" w:hAnsi="Segoe UI" w:cs="Segoe UI"/>
+          <w:color w:val="0F1115"/>
+        </w:rPr>
+      </w:pPr>
+      <w:r>
+        <w:rPr>
+          <w:rFonts w:ascii="Segoe UI" w:hAnsi="Segoe UI" w:cs="Segoe UI"/>
+          <w:color w:val="0F1115"/>
+        </w:rPr>
+        <w:t xml:space="preserve">Created a database script with 8 tables, including attributes, constraints, and </w:t>
+      </w:r>
+      <w:r>
+        <w:rPr>
+          <w:rFonts w:ascii="Segoe UI" w:hAnsi="Segoe UI" w:cs="Segoe UI"/>
+          <w:color w:val="0F1115"/>
+        </w:rPr>
+        <w:t>relationships.</w:t>
+      </w:r>
+    </w:p>
+    <w:p>
+      <w:pPr>
+        <w:pStyle w:val="ds-markdown-paragraph"/>
+        <w:numPr>
+          <w:ilvl w:val="0"/>
+          <w:numId w:val="4"/>
+        </w:numPr>
+        <w:shd w:val="clear" w:color="auto" w:fill="FFFFFF"/>
+        <w:spacing w:before="0" w:beforeAutospacing="0" w:after="0" w:afterAutospacing="0" w:line="420" w:lineRule="atLeast"/>
+        <w:rPr>
+          <w:rFonts w:ascii="Segoe UI" w:hAnsi="Segoe UI" w:cs="Segoe UI"/>
+          <w:color w:val="0F1115"/>
+        </w:rPr>
+      </w:pPr>
+      <w:r>
+        <w:rPr>
+          <w:rFonts w:ascii="Segoe UI" w:hAnsi="Segoe UI" w:cs="Segoe UI"/>
+          <w:color w:val="0F1115"/>
+        </w:rPr>
+        <w:t xml:space="preserve">Met with Professor Weber to review and validate the database logic and </w:t>
+      </w:r>
+      <w:r>
+        <w:rPr>
+          <w:rFonts w:ascii="Segoe UI" w:hAnsi="Segoe UI" w:cs="Segoe UI"/>
+          <w:color w:val="0F1115"/>
+        </w:rPr>
+        <w:t>structure.</w:t>
+      </w:r>
+    </w:p>
+    <w:p>
+      <w:pPr>
+        <w:pStyle w:val="ds-markdown-paragraph"/>
+        <w:numPr>
+          <w:ilvl w:val="0"/>
+          <w:numId w:val="4"/>
+        </w:numPr>
+        <w:shd w:val="clear" w:color="auto" w:fill="FFFFFF"/>
+        <w:spacing w:before="0" w:beforeAutospacing="0" w:after="0" w:afterAutospacing="0" w:line="420" w:lineRule="atLeast"/>
+        <w:rPr>
+          <w:rFonts w:ascii="Segoe UI" w:hAnsi="Segoe UI" w:cs="Segoe UI"/>
+          <w:color w:val="0F1115"/>
+        </w:rPr>
+      </w:pPr>
+      <w:r>
+        <w:rPr>
+          <w:rFonts w:ascii="Segoe UI" w:hAnsi="Segoe UI" w:cs="Segoe UI"/>
+          <w:color w:val="0F1115"/>
+        </w:rPr>
+        <w:t xml:space="preserve">Prepared an acknowledgment document to recognize the assistance of Professor </w:t>
+      </w:r>
+      <w:r>
+        <w:rPr>
+          <w:rFonts w:ascii="Segoe UI" w:hAnsi="Segoe UI" w:cs="Segoe UI"/>
+          <w:color w:val="0F1115"/>
+        </w:rPr>
+        <w:t>Dayu</w:t>
+      </w:r>
+      <w:r>
+        <w:rPr>
+          <w:rFonts w:ascii="Segoe UI" w:hAnsi="Segoe UI" w:cs="Segoe UI"/>
+          <w:color w:val="0F1115"/>
+        </w:rPr>
+        <w:t xml:space="preserve"> and Professor </w:t>
+      </w:r>
+      <w:r>
+        <w:rPr>
+          <w:rFonts w:ascii="Segoe UI" w:hAnsi="Segoe UI" w:cs="Segoe UI"/>
+          <w:color w:val="0F1115"/>
+        </w:rPr>
+        <w:t>Weber.</w:t>
+      </w:r>
+    </w:p>
+    <w:p>
+      <w:pPr>
+        <w:pStyle w:val="ds-markdown-paragraph"/>
+        <w:numPr>
+          <w:ilvl w:val="0"/>
+          <w:numId w:val="4"/>
+        </w:numPr>
+        <w:shd w:val="clear" w:color="auto" w:fill="FFFFFF"/>
+        <w:spacing w:before="0" w:beforeAutospacing="0" w:after="0" w:afterAutospacing="0" w:line="420" w:lineRule="atLeast"/>
+        <w:rPr>
+          <w:rFonts w:ascii="Segoe UI" w:hAnsi="Segoe UI" w:cs="Segoe UI"/>
+          <w:color w:val="0F1115"/>
+        </w:rPr>
+      </w:pPr>
+      <w:r>
+        <w:rPr>
+          <w:rFonts w:ascii="Segoe UI" w:hAnsi="Segoe UI" w:cs="Segoe UI"/>
+          <w:color w:val="0F1115"/>
+        </w:rPr>
+        <w:t>Developed logo inspirations and initial design concepts</w:t>
+      </w:r>
+      <w:r>
+        <w:rPr>
+          <w:rFonts w:ascii="Segoe UI" w:hAnsi="Segoe UI" w:cs="Segoe UI"/>
+          <w:color w:val="0F1115"/>
+        </w:rPr>
+        <w:t>.</w:t>
+      </w:r>
+    </w:p>
+    <w:p>
+      <w:pPr>
+        <w:pStyle w:val="ds-markdown-paragraph"/>
+        <w:numPr>
+          <w:ilvl w:val="0"/>
+          <w:numId w:val="4"/>
+        </w:numPr>
+        <w:shd w:val="clear" w:color="auto" w:fill="FFFFFF"/>
+        <w:spacing w:before="0" w:beforeAutospacing="0" w:after="0" w:afterAutospacing="0" w:line="420" w:lineRule="atLeast"/>
+        <w:rPr>
+          <w:rFonts w:ascii="Segoe UI" w:hAnsi="Segoe UI" w:cs="Segoe UI"/>
+          <w:color w:val="0F1115"/>
+        </w:rPr>
+      </w:pPr>
+      <w:r>
+        <w:rPr>
+          <w:rFonts w:ascii="Segoe UI" w:hAnsi="Segoe UI" w:cs="Segoe UI"/>
+          <w:color w:val="0F1115"/>
+        </w:rPr>
+        <w:t>Created Flow Chart Document.</w:t>
+      </w:r>
+    </w:p>
+    <w:p>
+      <w:pPr>
+        <w:pStyle w:val="ds-markdown-paragraph"/>
+        <w:numPr>
+          <w:ilvl w:val="0"/>
+          <w:numId w:val="4"/>
+        </w:numPr>
+        <w:shd w:val="clear" w:color="auto" w:fill="FFFFFF"/>
+        <w:spacing w:before="0" w:beforeAutospacing="0" w:after="0" w:afterAutospacing="0" w:line="420" w:lineRule="atLeast"/>
+        <w:rPr>
+          <w:rFonts w:ascii="Segoe UI" w:hAnsi="Segoe UI" w:cs="Segoe UI"/>
+          <w:color w:val="0F1115"/>
+        </w:rPr>
+      </w:pPr>
+      <w:r>
+        <w:rPr>
+          <w:rFonts w:ascii="Segoe UI" w:hAnsi="Segoe UI" w:cs="Segoe UI"/>
+          <w:color w:val="0F1115"/>
+          <w:shd w:val="clear" w:color="auto" w:fill="FFFFFF"/>
+        </w:rPr>
+        <w:t xml:space="preserve">Created the content </w:t>
+      </w:r>
+      <w:r>
+        <w:rPr>
+          <w:rFonts w:ascii="Segoe UI" w:hAnsi="Segoe UI" w:cs="Segoe UI"/>
+          <w:color w:val="0F1115"/>
+          <w:shd w:val="clear" w:color="auto" w:fill="FFFFFF"/>
+        </w:rPr>
+        <w:t>of the</w:t>
+      </w:r>
+      <w:r>
+        <w:rPr>
+          <w:rFonts w:ascii="Segoe UI" w:hAnsi="Segoe UI" w:cs="Segoe UI"/>
+          <w:color w:val="0F1115"/>
+          <w:shd w:val="clear" w:color="auto" w:fill="FFFFFF"/>
+        </w:rPr>
+        <w:t xml:space="preserve"> backend </w:t>
+      </w:r>
+      <w:r>
+        <w:rPr>
+          <w:rFonts w:ascii="Segoe UI" w:hAnsi="Segoe UI" w:cs="Segoe UI"/>
+          <w:color w:val="0F1115"/>
+          <w:shd w:val="clear" w:color="auto" w:fill="FFFFFF"/>
+        </w:rPr>
+        <w:t>slides</w:t>
+      </w:r>
+      <w:r>
+        <w:rPr>
+          <w:rFonts w:ascii="Segoe UI" w:hAnsi="Segoe UI" w:cs="Segoe UI"/>
+          <w:color w:val="0F1115"/>
+          <w:shd w:val="clear" w:color="auto" w:fill="FFFFFF"/>
+        </w:rPr>
+        <w:t xml:space="preserve"> for the presentation</w:t>
+      </w:r>
+      <w:r>
+        <w:rPr>
+          <w:rFonts w:ascii="Segoe UI" w:hAnsi="Segoe UI" w:cs="Segoe UI"/>
+          <w:color w:val="0F1115"/>
+          <w:shd w:val="clear" w:color="auto" w:fill="FFFFFF"/>
+        </w:rPr>
+        <w:t>.</w:t>
+      </w:r>
+    </w:p>
+    <w:p>
+      <w:pPr>
+        <w:pStyle w:val="ds-markdown-paragraph"/>
+        <w:shd w:val="clear" w:color="auto" w:fill="FFFFFF"/>
+        <w:spacing w:before="0" w:beforeAutospacing="0" w:after="0" w:afterAutospacing="0" w:line="420" w:lineRule="atLeast"/>
+        <w:rPr>
+          <w:rFonts w:ascii="Segoe UI" w:hAnsi="Segoe UI" w:cs="Segoe UI"/>
+          <w:color w:val="0F1115"/>
+          <w:shd w:val="clear" w:color="auto" w:fill="FFFFFF"/>
+        </w:rPr>
+      </w:pPr>
+    </w:p>
+    <w:p>
+      <w:pPr>
+        <w:pStyle w:val="ds-markdown-paragraph"/>
+        <w:shd w:val="clear" w:color="auto" w:fill="FFFFFF"/>
+        <w:spacing w:before="0" w:beforeAutospacing="0" w:after="0" w:afterAutospacing="0" w:line="420" w:lineRule="atLeast"/>
+        <w:rPr>
+          <w:rFonts w:ascii="Segoe UI" w:hAnsi="Segoe UI" w:cs="Segoe UI"/>
+          <w:color w:val="0F1115"/>
+          <w:shd w:val="clear" w:color="auto" w:fill="FFFFFF"/>
+        </w:rPr>
+      </w:pPr>
+    </w:p>
+    <w:p>
+      <w:pPr>
+        <w:pStyle w:val="ds-markdown-paragraph"/>
+        <w:shd w:val="clear" w:color="auto" w:fill="FFFFFF"/>
+        <w:spacing w:before="0" w:beforeAutospacing="0" w:after="0" w:afterAutospacing="0" w:line="420" w:lineRule="atLeast"/>
+        <w:rPr>
+          <w:rFonts w:ascii="Segoe UI" w:hAnsi="Segoe UI" w:cs="Segoe UI"/>
+          <w:color w:val="0F1115"/>
+        </w:rPr>
+      </w:pPr>
+    </w:p>
+    <w:p>
+      <w:pPr>
+        <w:pStyle w:val="ListParagraph"/>
+        <w:spacing w:after="120" w:line="480" w:lineRule="auto"/>
+        <w:ind w:left="1080"/>
+        <w:rPr>
+          <w:rFonts w:ascii="Times New Roman" w:eastAsia="Times New Roman" w:hAnsi="Times New Roman" w:cs="Times New Roman"/>
+          <w:color w:val="0F1115"/>
+          <w:kern w:val="0"/>
+          <w14:ligatures w14:val="none"/>
+        </w:rPr>
+      </w:pPr>
     </w:p>
     <w:p>
       <w:pPr>
@@ -311,6 +561,7 @@
           <w:kern w:val="0"/>
           <w14:ligatures w14:val="none"/>
         </w:rPr>
+        <w:lastRenderedPageBreak/>
         <w:t>Daniel Austin:</w:t>
       </w:r>
     </w:p>
@@ -377,8 +628,381 @@
 </file>
 
 <file path=word/numbering.xml><?xml version="1.0" encoding="utf-8"?>
-<w:numbering xmlns:wpc="http://schemas.microsoft.com/office/word/2010/wordprocessingCanvas" xmlns:cx="http://schemas.microsoft.com/office/drawing/2014/chartex" xmlns:cx1="http://schemas.microsoft.com/office/drawing/2015/9/8/chartex" xmlns:cx2="http://schemas.microsoft.com/office/drawing/2015/10/21/chartex" xmlns:cx3="http://schemas.microsoft.com/office/drawing/2016/5/9/chartex" xmlns:cx4="http://schemas.microsoft.com/office/drawing/2016/5/10/chartex" xmlns:cx5="http://schemas.microsoft.com/office/drawing/2016/5/11/chartex" xmlns:cx6="http://schemas.microsoft.com/office/drawing/2016/5/12/chartex" xmlns:cx7="http://schemas.microsoft.com/office/drawing/2016/5/13/chartex" xmlns:cx8="http://schemas.microsoft.com/office/drawing/2016/5/14/chartex" xmlns:mc="http://schemas.openxmlformats.org/markup-compatibility/2006" xmlns:aink="http://schemas.microsoft.com/office/drawing/2016/ink" xmlns:am3d="http://schemas.microsoft.com/office/drawing/2017/model3d" xmlns:o="urn:schemas-microsoft-com:office:office" xmlns:oel="http://schemas.microsoft.com/office/2019/extlst" xmlns:r="http://schemas.openxmlformats.org/officeDocument/2006/relationships" xmlns:m="http://schemas.openxmlformats.org/officeDocument/2006/math" xmlns:v="urn:schemas-microsoft-com:vml" xmlns:wp14="http://schemas.microsoft.com/office/word/2010/wordprocessingDrawing" xmlns:wp="http://schemas.openxmlformats.org/drawingml/2006/wordprocessingDrawing" xmlns:w10="urn:schemas-microsoft-com:office:word" xmlns:w="http://schemas.openxmlformats.org/wordprocessingml/2006/main" xmlns:w14="http://schemas.microsoft.com/office/word/2010/wordml" xmlns:w15="http://schemas.microsoft.com/office/word/2012/wordml" xmlns:w16cex="http://schemas.microsoft.com/office/word/2018/wordml/cex" xmlns:w16cid="http://schemas.microsoft.com/office/word/2016/wordml/cid" xmlns:w16="http://schemas.microsoft.com/office/word/2018/wordml" xmlns:w16du="http://schemas.microsoft.com/office/word/2023/wordml/word16du" xmlns:w16sdtdh="http://schemas.microsoft.com/office/word/2020/wordml/sdtdatahash" xmlns:w16sdtfl="http://schemas.microsoft.com/office/word/2024/wordml/sdtformatlock" xmlns:w16se="http://schemas.microsoft.com/office/word/2015/wordml/symex" xmlns:wpg="http://schemas.microsoft.com/office/word/2010/wordprocessingGroup" xmlns:wpi="http://schemas.microsoft.com/office/word/2010/wordprocessingInk" xmlns:wne="http://schemas.microsoft.com/office/word/2006/wordml" xmlns:wps="http://schemas.microsoft.com/office/word/2010/wordprocessingShape" mc:Ignorable="w14 w15 w16se w16cid w16 w16cex w16sdtdh w16sdtfl w16du wp14">
+<w:numbering xmlns:wpc="http://schemas.microsoft.com/office/word/2010/wordprocessingCanvas" xmlns:cx="http://schemas.microsoft.com/office/drawing/2014/chartex" xmlns:cx1="http://schemas.microsoft.com/office/drawing/2015/9/8/chartex" xmlns:cx2="http://schemas.microsoft.com/office/drawing/2015/10/21/chartex" xmlns:cx3="http://schemas.microsoft.com/office/drawing/2016/5/9/chartex" xmlns:cx4="http://schemas.microsoft.com/office/drawing/2016/5/10/chartex" xmlns:cx5="http://schemas.microsoft.com/office/drawing/2016/5/11/chartex" xmlns:cx6="http://schemas.microsoft.com/office/drawing/2016/5/12/chartex" xmlns:cx7="http://schemas.microsoft.com/office/drawing/2016/5/13/chartex" xmlns:cx8="http://schemas.microsoft.com/office/drawing/2016/5/14/chartex" xmlns:mc="http://schemas.openxmlformats.org/markup-compatibility/2006" xmlns:aink="http://schemas.microsoft.com/office/drawing/2016/ink" xmlns:am3d="http://schemas.microsoft.com/office/drawing/2017/model3d" xmlns:o="urn:schemas-microsoft-com:office:office" xmlns:oel="http://schemas.microsoft.com/office/2019/extlst" xmlns:r="http://schemas.openxmlformats.org/officeDocument/2006/relationships" xmlns:m="http://schemas.openxmlformats.org/officeDocument/2006/math" xmlns:v="urn:schemas-microsoft-com:vml" xmlns:wp14="http://schemas.microsoft.com/office/word/2010/wordprocessingDrawing" xmlns:wp="http://schemas.openxmlformats.org/drawingml/2006/wordprocessingDrawing" xmlns:w10="urn:schemas-microsoft-com:office:word" xmlns:w="http://schemas.openxmlformats.org/wordprocessingml/2006/main" xmlns:w14="http://schemas.microsoft.com/office/word/2010/wordml" xmlns:w15="http://schemas.microsoft.com/office/word/2012/wordml" xmlns:w16cex="http://schemas.microsoft.com/office/word/2018/wordml/cex" xmlns:w16cid="http://schemas.microsoft.com/office/word/2016/wordml/cid" xmlns:w16="http://schemas.microsoft.com/office/word/2018/wordml" xmlns:w16du="http://schemas.microsoft.com/office/word/2023/wordml/word16du" xmlns:w16sdtdh="http://schemas.microsoft.com/office/word/2020/wordml/sdtdatahash" xmlns:w16se="http://schemas.microsoft.com/office/word/2015/wordml/symex" xmlns:wpg="http://schemas.microsoft.com/office/word/2010/wordprocessingGroup" xmlns:wpi="http://schemas.microsoft.com/office/word/2010/wordprocessingInk" xmlns:wne="http://schemas.microsoft.com/office/word/2006/wordml" xmlns:wps="http://schemas.microsoft.com/office/word/2010/wordprocessingShape" mc:Ignorable="w14 w15 w16se w16cid w16 w16cex w16sdtdh w16du wp14">
   <w:abstractNum w:abstractNumId="0" w15:restartNumberingAfterBreak="0">
+    <w:nsid w:val="028134E2"/>
+    <w:multiLevelType w:val="hybridMultilevel"/>
+    <w:tmpl w:val="C5CA768A"/>
+    <w:lvl w:ilvl="0" w:tplc="55667C36">
+      <w:numFmt w:val="bullet"/>
+      <w:lvlText w:val="-"/>
+      <w:lvlJc w:val="left"/>
+      <w:pPr>
+        <w:ind w:left="1080" w:hanging="360"/>
+      </w:pPr>
+      <w:rPr>
+        <w:rFonts w:ascii="Times New Roman" w:eastAsia="Times New Roman" w:hAnsi="Times New Roman" w:cs="Times New Roman" w:hint="default"/>
+      </w:rPr>
+    </w:lvl>
+    <w:lvl w:ilvl="1" w:tplc="04090003" w:tentative="1">
+      <w:start w:val="1"/>
+      <w:numFmt w:val="bullet"/>
+      <w:lvlText w:val="o"/>
+      <w:lvlJc w:val="left"/>
+      <w:pPr>
+        <w:ind w:left="1800" w:hanging="360"/>
+      </w:pPr>
+      <w:rPr>
+        <w:rFonts w:ascii="Courier New" w:hAnsi="Courier New" w:cs="Courier New" w:hint="default"/>
+      </w:rPr>
+    </w:lvl>
+    <w:lvl w:ilvl="2" w:tplc="04090005" w:tentative="1">
+      <w:start w:val="1"/>
+      <w:numFmt w:val="bullet"/>
+      <w:lvlText w:val=""/>
+      <w:lvlJc w:val="left"/>
+      <w:pPr>
+        <w:ind w:left="2520" w:hanging="360"/>
+      </w:pPr>
+      <w:rPr>
+        <w:rFonts w:ascii="Wingdings" w:hAnsi="Wingdings" w:hint="default"/>
+      </w:rPr>
+    </w:lvl>
+    <w:lvl w:ilvl="3" w:tplc="04090001" w:tentative="1">
+      <w:start w:val="1"/>
+      <w:numFmt w:val="bullet"/>
+      <w:lvlText w:val=""/>
+      <w:lvlJc w:val="left"/>
+      <w:pPr>
+        <w:ind w:left="3240" w:hanging="360"/>
+      </w:pPr>
+      <w:rPr>
+        <w:rFonts w:ascii="Symbol" w:hAnsi="Symbol" w:hint="default"/>
+      </w:rPr>
+    </w:lvl>
+    <w:lvl w:ilvl="4" w:tplc="04090003" w:tentative="1">
+      <w:start w:val="1"/>
+      <w:numFmt w:val="bullet"/>
+      <w:lvlText w:val="o"/>
+      <w:lvlJc w:val="left"/>
+      <w:pPr>
+        <w:ind w:left="3960" w:hanging="360"/>
+      </w:pPr>
+      <w:rPr>
+        <w:rFonts w:ascii="Courier New" w:hAnsi="Courier New" w:cs="Courier New" w:hint="default"/>
+      </w:rPr>
+    </w:lvl>
+    <w:lvl w:ilvl="5" w:tplc="04090005" w:tentative="1">
+      <w:start w:val="1"/>
+      <w:numFmt w:val="bullet"/>
+      <w:lvlText w:val=""/>
+      <w:lvlJc w:val="left"/>
+      <w:pPr>
+        <w:ind w:left="4680" w:hanging="360"/>
+      </w:pPr>
+      <w:rPr>
+        <w:rFonts w:ascii="Wingdings" w:hAnsi="Wingdings" w:hint="default"/>
+      </w:rPr>
+    </w:lvl>
+    <w:lvl w:ilvl="6" w:tplc="04090001" w:tentative="1">
+      <w:start w:val="1"/>
+      <w:numFmt w:val="bullet"/>
+      <w:lvlText w:val=""/>
+      <w:lvlJc w:val="left"/>
+      <w:pPr>
+        <w:ind w:left="5400" w:hanging="360"/>
+      </w:pPr>
+      <w:rPr>
+        <w:rFonts w:ascii="Symbol" w:hAnsi="Symbol" w:hint="default"/>
+      </w:rPr>
+    </w:lvl>
+    <w:lvl w:ilvl="7" w:tplc="04090003" w:tentative="1">
+      <w:start w:val="1"/>
+      <w:numFmt w:val="bullet"/>
+      <w:lvlText w:val="o"/>
+      <w:lvlJc w:val="left"/>
+      <w:pPr>
+        <w:ind w:left="6120" w:hanging="360"/>
+      </w:pPr>
+      <w:rPr>
+        <w:rFonts w:ascii="Courier New" w:hAnsi="Courier New" w:cs="Courier New" w:hint="default"/>
+      </w:rPr>
+    </w:lvl>
+    <w:lvl w:ilvl="8" w:tplc="04090005" w:tentative="1">
+      <w:start w:val="1"/>
+      <w:numFmt w:val="bullet"/>
+      <w:lvlText w:val=""/>
+      <w:lvlJc w:val="left"/>
+      <w:pPr>
+        <w:ind w:left="6840" w:hanging="360"/>
+      </w:pPr>
+      <w:rPr>
+        <w:rFonts w:ascii="Wingdings" w:hAnsi="Wingdings" w:hint="default"/>
+      </w:rPr>
+    </w:lvl>
+  </w:abstractNum>
+  <w:abstractNum w:abstractNumId="1" w15:restartNumberingAfterBreak="0">
+    <w:nsid w:val="18B63642"/>
+    <w:multiLevelType w:val="hybridMultilevel"/>
+    <w:tmpl w:val="BDA6FB06"/>
+    <w:lvl w:ilvl="0" w:tplc="57B63620">
+      <w:numFmt w:val="bullet"/>
+      <w:lvlText w:val="-"/>
+      <w:lvlJc w:val="left"/>
+      <w:pPr>
+        <w:ind w:left="1080" w:hanging="360"/>
+      </w:pPr>
+      <w:rPr>
+        <w:rFonts w:ascii="Segoe UI" w:eastAsia="Times New Roman" w:hAnsi="Segoe UI" w:cs="Segoe UI" w:hint="default"/>
+      </w:rPr>
+    </w:lvl>
+    <w:lvl w:ilvl="1" w:tplc="04090003" w:tentative="1">
+      <w:start w:val="1"/>
+      <w:numFmt w:val="bullet"/>
+      <w:lvlText w:val="o"/>
+      <w:lvlJc w:val="left"/>
+      <w:pPr>
+        <w:ind w:left="1800" w:hanging="360"/>
+      </w:pPr>
+      <w:rPr>
+        <w:rFonts w:ascii="Courier New" w:hAnsi="Courier New" w:cs="Courier New" w:hint="default"/>
+      </w:rPr>
+    </w:lvl>
+    <w:lvl w:ilvl="2" w:tplc="04090005" w:tentative="1">
+      <w:start w:val="1"/>
+      <w:numFmt w:val="bullet"/>
+      <w:lvlText w:val=""/>
+      <w:lvlJc w:val="left"/>
+      <w:pPr>
+        <w:ind w:left="2520" w:hanging="360"/>
+      </w:pPr>
+      <w:rPr>
+        <w:rFonts w:ascii="Wingdings" w:hAnsi="Wingdings" w:hint="default"/>
+      </w:rPr>
+    </w:lvl>
+    <w:lvl w:ilvl="3" w:tplc="04090001" w:tentative="1">
+      <w:start w:val="1"/>
+      <w:numFmt w:val="bullet"/>
+      <w:lvlText w:val=""/>
+      <w:lvlJc w:val="left"/>
+      <w:pPr>
+        <w:ind w:left="3240" w:hanging="360"/>
+      </w:pPr>
+      <w:rPr>
+        <w:rFonts w:ascii="Symbol" w:hAnsi="Symbol" w:hint="default"/>
+      </w:rPr>
+    </w:lvl>
+    <w:lvl w:ilvl="4" w:tplc="04090003" w:tentative="1">
+      <w:start w:val="1"/>
+      <w:numFmt w:val="bullet"/>
+      <w:lvlText w:val="o"/>
+      <w:lvlJc w:val="left"/>
+      <w:pPr>
+        <w:ind w:left="3960" w:hanging="360"/>
+      </w:pPr>
+      <w:rPr>
+        <w:rFonts w:ascii="Courier New" w:hAnsi="Courier New" w:cs="Courier New" w:hint="default"/>
+      </w:rPr>
+    </w:lvl>
+    <w:lvl w:ilvl="5" w:tplc="04090005" w:tentative="1">
+      <w:start w:val="1"/>
+      <w:numFmt w:val="bullet"/>
+      <w:lvlText w:val=""/>
+      <w:lvlJc w:val="left"/>
+      <w:pPr>
+        <w:ind w:left="4680" w:hanging="360"/>
+      </w:pPr>
+      <w:rPr>
+        <w:rFonts w:ascii="Wingdings" w:hAnsi="Wingdings" w:hint="default"/>
+      </w:rPr>
+    </w:lvl>
+    <w:lvl w:ilvl="6" w:tplc="04090001" w:tentative="1">
+      <w:start w:val="1"/>
+      <w:numFmt w:val="bullet"/>
+      <w:lvlText w:val=""/>
+      <w:lvlJc w:val="left"/>
+      <w:pPr>
+        <w:ind w:left="5400" w:hanging="360"/>
+      </w:pPr>
+      <w:rPr>
+        <w:rFonts w:ascii="Symbol" w:hAnsi="Symbol" w:hint="default"/>
+      </w:rPr>
+    </w:lvl>
+    <w:lvl w:ilvl="7" w:tplc="04090003" w:tentative="1">
+      <w:start w:val="1"/>
+      <w:numFmt w:val="bullet"/>
+      <w:lvlText w:val="o"/>
+      <w:lvlJc w:val="left"/>
+      <w:pPr>
+        <w:ind w:left="6120" w:hanging="360"/>
+      </w:pPr>
+      <w:rPr>
+        <w:rFonts w:ascii="Courier New" w:hAnsi="Courier New" w:cs="Courier New" w:hint="default"/>
+      </w:rPr>
+    </w:lvl>
+    <w:lvl w:ilvl="8" w:tplc="04090005" w:tentative="1">
+      <w:start w:val="1"/>
+      <w:numFmt w:val="bullet"/>
+      <w:lvlText w:val=""/>
+      <w:lvlJc w:val="left"/>
+      <w:pPr>
+        <w:ind w:left="6840" w:hanging="360"/>
+      </w:pPr>
+      <w:rPr>
+        <w:rFonts w:ascii="Wingdings" w:hAnsi="Wingdings" w:hint="default"/>
+      </w:rPr>
+    </w:lvl>
+  </w:abstractNum>
+  <w:abstractNum w:abstractNumId="2" w15:restartNumberingAfterBreak="0">
+    <w:nsid w:val="378A5593"/>
+    <w:multiLevelType w:val="multilevel"/>
+    <w:tmpl w:val="3ADEA4BE"/>
+    <w:lvl w:ilvl="0">
+      <w:start w:val="1"/>
+      <w:numFmt w:val="bullet"/>
+      <w:lvlText w:val=""/>
+      <w:lvlJc w:val="left"/>
+      <w:pPr>
+        <w:tabs>
+          <w:tab w:val="num" w:pos="720"/>
+        </w:tabs>
+        <w:ind w:left="720" w:hanging="360"/>
+      </w:pPr>
+      <w:rPr>
+        <w:rFonts w:ascii="Symbol" w:hAnsi="Symbol" w:hint="default"/>
+        <w:sz w:val="20"/>
+      </w:rPr>
+    </w:lvl>
+    <w:lvl w:ilvl="1" w:tentative="1">
+      <w:start w:val="1"/>
+      <w:numFmt w:val="bullet"/>
+      <w:lvlText w:val="o"/>
+      <w:lvlJc w:val="left"/>
+      <w:pPr>
+        <w:tabs>
+          <w:tab w:val="num" w:pos="1440"/>
+        </w:tabs>
+        <w:ind w:left="1440" w:hanging="360"/>
+      </w:pPr>
+      <w:rPr>
+        <w:rFonts w:ascii="Courier New" w:hAnsi="Courier New" w:hint="default"/>
+        <w:sz w:val="20"/>
+      </w:rPr>
+    </w:lvl>
+    <w:lvl w:ilvl="2" w:tentative="1">
+      <w:start w:val="1"/>
+      <w:numFmt w:val="bullet"/>
+      <w:lvlText w:val=""/>
+      <w:lvlJc w:val="left"/>
+      <w:pPr>
+        <w:tabs>
+          <w:tab w:val="num" w:pos="2160"/>
+        </w:tabs>
+        <w:ind w:left="2160" w:hanging="360"/>
+      </w:pPr>
+      <w:rPr>
+        <w:rFonts w:ascii="Wingdings" w:hAnsi="Wingdings" w:hint="default"/>
+        <w:sz w:val="20"/>
+      </w:rPr>
+    </w:lvl>
+    <w:lvl w:ilvl="3" w:tentative="1">
+      <w:start w:val="1"/>
+      <w:numFmt w:val="bullet"/>
+      <w:lvlText w:val=""/>
+      <w:lvlJc w:val="left"/>
+      <w:pPr>
+        <w:tabs>
+          <w:tab w:val="num" w:pos="2880"/>
+        </w:tabs>
+        <w:ind w:left="2880" w:hanging="360"/>
+      </w:pPr>
+      <w:rPr>
+        <w:rFonts w:ascii="Wingdings" w:hAnsi="Wingdings" w:hint="default"/>
+        <w:sz w:val="20"/>
+      </w:rPr>
+    </w:lvl>
+    <w:lvl w:ilvl="4" w:tentative="1">
+      <w:start w:val="1"/>
+      <w:numFmt w:val="bullet"/>
+      <w:lvlText w:val=""/>
+      <w:lvlJc w:val="left"/>
+      <w:pPr>
+        <w:tabs>
+          <w:tab w:val="num" w:pos="3600"/>
+        </w:tabs>
+        <w:ind w:left="3600" w:hanging="360"/>
+      </w:pPr>
+      <w:rPr>
+        <w:rFonts w:ascii="Wingdings" w:hAnsi="Wingdings" w:hint="default"/>
+        <w:sz w:val="20"/>
+      </w:rPr>
+    </w:lvl>
+    <w:lvl w:ilvl="5" w:tentative="1">
+      <w:start w:val="1"/>
+      <w:numFmt w:val="bullet"/>
+      <w:lvlText w:val=""/>
+      <w:lvlJc w:val="left"/>
+      <w:pPr>
+        <w:tabs>
+          <w:tab w:val="num" w:pos="4320"/>
+        </w:tabs>
+        <w:ind w:left="4320" w:hanging="360"/>
+      </w:pPr>
+      <w:rPr>
+        <w:rFonts w:ascii="Wingdings" w:hAnsi="Wingdings" w:hint="default"/>
+        <w:sz w:val="20"/>
+      </w:rPr>
+    </w:lvl>
+    <w:lvl w:ilvl="6" w:tentative="1">
+      <w:start w:val="1"/>
+      <w:numFmt w:val="bullet"/>
+      <w:lvlText w:val=""/>
+      <w:lvlJc w:val="left"/>
+      <w:pPr>
+        <w:tabs>
+          <w:tab w:val="num" w:pos="5040"/>
+        </w:tabs>
+        <w:ind w:left="5040" w:hanging="360"/>
+      </w:pPr>
+      <w:rPr>
+        <w:rFonts w:ascii="Wingdings" w:hAnsi="Wingdings" w:hint="default"/>
+        <w:sz w:val="20"/>
+      </w:rPr>
+    </w:lvl>
+    <w:lvl w:ilvl="7" w:tentative="1">
+      <w:start w:val="1"/>
+      <w:numFmt w:val="bullet"/>
+      <w:lvlText w:val=""/>
+      <w:lvlJc w:val="left"/>
+      <w:pPr>
+        <w:tabs>
+          <w:tab w:val="num" w:pos="5760"/>
+        </w:tabs>
+        <w:ind w:left="5760" w:hanging="360"/>
+      </w:pPr>
+      <w:rPr>
+        <w:rFonts w:ascii="Wingdings" w:hAnsi="Wingdings" w:hint="default"/>
+        <w:sz w:val="20"/>
+      </w:rPr>
+    </w:lvl>
+    <w:lvl w:ilvl="8" w:tentative="1">
+      <w:start w:val="1"/>
+      <w:numFmt w:val="bullet"/>
+      <w:lvlText w:val=""/>
+      <w:lvlJc w:val="left"/>
+      <w:pPr>
+        <w:tabs>
+          <w:tab w:val="num" w:pos="6480"/>
+        </w:tabs>
+        <w:ind w:left="6480" w:hanging="360"/>
+      </w:pPr>
+      <w:rPr>
+        <w:rFonts w:ascii="Wingdings" w:hAnsi="Wingdings" w:hint="default"/>
+        <w:sz w:val="20"/>
+      </w:rPr>
+    </w:lvl>
+  </w:abstractNum>
+  <w:abstractNum w:abstractNumId="3" w15:restartNumberingAfterBreak="0">
     <w:nsid w:val="41F93453"/>
     <w:multiLevelType w:val="multilevel"/>
     <w:tmpl w:val="13A89AB8"/>
@@ -528,13 +1152,22 @@
     </w:lvl>
   </w:abstractNum>
   <w:num w:numId="1" w16cid:durableId="146675652">
+    <w:abstractNumId w:val="3"/>
+  </w:num>
+  <w:num w:numId="2" w16cid:durableId="780077297">
     <w:abstractNumId w:val="0"/>
+  </w:num>
+  <w:num w:numId="3" w16cid:durableId="1273050460">
+    <w:abstractNumId w:val="2"/>
+  </w:num>
+  <w:num w:numId="4" w16cid:durableId="839391234">
+    <w:abstractNumId w:val="1"/>
   </w:num>
 </w:numbering>
 </file>
 
 <file path=word/styles.xml><?xml version="1.0" encoding="utf-8"?>
-<w:styles xmlns:mc="http://schemas.openxmlformats.org/markup-compatibility/2006" xmlns:r="http://schemas.openxmlformats.org/officeDocument/2006/relationships" xmlns:w="http://schemas.openxmlformats.org/wordprocessingml/2006/main" xmlns:w14="http://schemas.microsoft.com/office/word/2010/wordml" xmlns:w15="http://schemas.microsoft.com/office/word/2012/wordml" xmlns:w16cex="http://schemas.microsoft.com/office/word/2018/wordml/cex" xmlns:w16cid="http://schemas.microsoft.com/office/word/2016/wordml/cid" xmlns:w16="http://schemas.microsoft.com/office/word/2018/wordml" xmlns:w16du="http://schemas.microsoft.com/office/word/2023/wordml/word16du" xmlns:w16sdtdh="http://schemas.microsoft.com/office/word/2020/wordml/sdtdatahash" xmlns:w16sdtfl="http://schemas.microsoft.com/office/word/2024/wordml/sdtformatlock" xmlns:w16se="http://schemas.microsoft.com/office/word/2015/wordml/symex" mc:Ignorable="w14 w15 w16se w16cid w16 w16cex w16sdtdh w16sdtfl w16du">
+<w:styles xmlns:mc="http://schemas.openxmlformats.org/markup-compatibility/2006" xmlns:r="http://schemas.openxmlformats.org/officeDocument/2006/relationships" xmlns:w="http://schemas.openxmlformats.org/wordprocessingml/2006/main" xmlns:w14="http://schemas.microsoft.com/office/word/2010/wordml" xmlns:w15="http://schemas.microsoft.com/office/word/2012/wordml" xmlns:w16cex="http://schemas.microsoft.com/office/word/2018/wordml/cex" xmlns:w16cid="http://schemas.microsoft.com/office/word/2016/wordml/cid" xmlns:w16="http://schemas.microsoft.com/office/word/2018/wordml" xmlns:w16du="http://schemas.microsoft.com/office/word/2023/wordml/word16du" xmlns:w16sdtdh="http://schemas.microsoft.com/office/word/2020/wordml/sdtdatahash" xmlns:w16se="http://schemas.microsoft.com/office/word/2015/wordml/symex" mc:Ignorable="w14 w15 w16se w16cid w16 w16cex w16sdtdh w16du">
   <w:docDefaults>
     <w:rPrDefault>
       <w:rPr>
@@ -1454,6 +2087,19 @@
       <w:spacing w:val="5"/>
     </w:rPr>
   </w:style>
+  <w:style w:type="paragraph" w:customStyle="1" w:styleId="ds-markdown-paragraph">
+    <w:name w:val="ds-markdown-paragraph"/>
+    <w:basedOn w:val="Normal"/>
+    <w:rsid w:val="000A7FB4"/>
+    <w:pPr>
+      <w:spacing w:before="100" w:beforeAutospacing="1" w:after="100" w:afterAutospacing="1" w:line="240" w:lineRule="auto"/>
+    </w:pPr>
+    <w:rPr>
+      <w:rFonts w:ascii="Times New Roman" w:eastAsia="Times New Roman" w:hAnsi="Times New Roman" w:cs="Times New Roman"/>
+      <w:kern w:val="0"/>
+      <w14:ligatures w14:val="none"/>
+    </w:rPr>
+  </w:style>
 </w:styles>
 </file>
 

</xml_diff>

<commit_message>
Updated with my contributions
</commit_message>
<xml_diff>
--- a/docs/phase2/team-contribution.docx
+++ b/docs/phase2/team-contribution.docx
@@ -1,6 +1,6 @@
 
 <file path=word/document.xml><?xml version="1.0" encoding="utf-8"?>
-<w:document xmlns:wpc="http://schemas.microsoft.com/office/word/2010/wordprocessingCanvas" xmlns:cx="http://schemas.microsoft.com/office/drawing/2014/chartex" xmlns:cx1="http://schemas.microsoft.com/office/drawing/2015/9/8/chartex" xmlns:cx2="http://schemas.microsoft.com/office/drawing/2015/10/21/chartex" xmlns:cx3="http://schemas.microsoft.com/office/drawing/2016/5/9/chartex" xmlns:cx4="http://schemas.microsoft.com/office/drawing/2016/5/10/chartex" xmlns:cx5="http://schemas.microsoft.com/office/drawing/2016/5/11/chartex" xmlns:cx6="http://schemas.microsoft.com/office/drawing/2016/5/12/chartex" xmlns:cx7="http://schemas.microsoft.com/office/drawing/2016/5/13/chartex" xmlns:cx8="http://schemas.microsoft.com/office/drawing/2016/5/14/chartex" xmlns:mc="http://schemas.openxmlformats.org/markup-compatibility/2006" xmlns:aink="http://schemas.microsoft.com/office/drawing/2016/ink" xmlns:am3d="http://schemas.microsoft.com/office/drawing/2017/model3d" xmlns:o="urn:schemas-microsoft-com:office:office" xmlns:oel="http://schemas.microsoft.com/office/2019/extlst" xmlns:r="http://schemas.openxmlformats.org/officeDocument/2006/relationships" xmlns:m="http://schemas.openxmlformats.org/officeDocument/2006/math" xmlns:v="urn:schemas-microsoft-com:vml" xmlns:wp14="http://schemas.microsoft.com/office/word/2010/wordprocessingDrawing" xmlns:wp="http://schemas.openxmlformats.org/drawingml/2006/wordprocessingDrawing" xmlns:w10="urn:schemas-microsoft-com:office:word" xmlns:w="http://schemas.openxmlformats.org/wordprocessingml/2006/main" xmlns:w14="http://schemas.microsoft.com/office/word/2010/wordml" xmlns:w15="http://schemas.microsoft.com/office/word/2012/wordml" xmlns:w16cex="http://schemas.microsoft.com/office/word/2018/wordml/cex" xmlns:w16cid="http://schemas.microsoft.com/office/word/2016/wordml/cid" xmlns:w16="http://schemas.microsoft.com/office/word/2018/wordml" xmlns:w16du="http://schemas.microsoft.com/office/word/2023/wordml/word16du" xmlns:w16sdtdh="http://schemas.microsoft.com/office/word/2020/wordml/sdtdatahash" xmlns:w16se="http://schemas.microsoft.com/office/word/2015/wordml/symex" xmlns:wpg="http://schemas.microsoft.com/office/word/2010/wordprocessingGroup" xmlns:wpi="http://schemas.microsoft.com/office/word/2010/wordprocessingInk" xmlns:wne="http://schemas.microsoft.com/office/word/2006/wordml" xmlns:wps="http://schemas.microsoft.com/office/word/2010/wordprocessingShape" mc:Ignorable="w14 w15 w16se w16cid w16 w16cex w16sdtdh w16du wp14">
+<w:document xmlns:wpc="http://schemas.microsoft.com/office/word/2010/wordprocessingCanvas" xmlns:cx="http://schemas.microsoft.com/office/drawing/2014/chartex" xmlns:cx1="http://schemas.microsoft.com/office/drawing/2015/9/8/chartex" xmlns:cx2="http://schemas.microsoft.com/office/drawing/2015/10/21/chartex" xmlns:cx3="http://schemas.microsoft.com/office/drawing/2016/5/9/chartex" xmlns:cx4="http://schemas.microsoft.com/office/drawing/2016/5/10/chartex" xmlns:cx5="http://schemas.microsoft.com/office/drawing/2016/5/11/chartex" xmlns:cx6="http://schemas.microsoft.com/office/drawing/2016/5/12/chartex" xmlns:cx7="http://schemas.microsoft.com/office/drawing/2016/5/13/chartex" xmlns:cx8="http://schemas.microsoft.com/office/drawing/2016/5/14/chartex" xmlns:mc="http://schemas.openxmlformats.org/markup-compatibility/2006" xmlns:aink="http://schemas.microsoft.com/office/drawing/2016/ink" xmlns:am3d="http://schemas.microsoft.com/office/drawing/2017/model3d" xmlns:o="urn:schemas-microsoft-com:office:office" xmlns:oel="http://schemas.microsoft.com/office/2019/extlst" xmlns:r="http://schemas.openxmlformats.org/officeDocument/2006/relationships" xmlns:m="http://schemas.openxmlformats.org/officeDocument/2006/math" xmlns:v="urn:schemas-microsoft-com:vml" xmlns:wp14="http://schemas.microsoft.com/office/word/2010/wordprocessingDrawing" xmlns:wp="http://schemas.openxmlformats.org/drawingml/2006/wordprocessingDrawing" xmlns:w10="urn:schemas-microsoft-com:office:word" xmlns:w="http://schemas.openxmlformats.org/wordprocessingml/2006/main" xmlns:w14="http://schemas.microsoft.com/office/word/2010/wordml" xmlns:w15="http://schemas.microsoft.com/office/word/2012/wordml" xmlns:w16cex="http://schemas.microsoft.com/office/word/2018/wordml/cex" xmlns:w16cid="http://schemas.microsoft.com/office/word/2016/wordml/cid" xmlns:w16="http://schemas.microsoft.com/office/word/2018/wordml" xmlns:w16du="http://schemas.microsoft.com/office/word/2023/wordml/word16du" xmlns:w16sdtdh="http://schemas.microsoft.com/office/word/2020/wordml/sdtdatahash" xmlns:w16sdtfl="http://schemas.microsoft.com/office/word/2024/wordml/sdtformatlock" xmlns:w16se="http://schemas.microsoft.com/office/word/2015/wordml/symex" xmlns:wpg="http://schemas.microsoft.com/office/word/2010/wordprocessingGroup" xmlns:wpi="http://schemas.microsoft.com/office/word/2010/wordprocessingInk" xmlns:wne="http://schemas.microsoft.com/office/word/2006/wordml" xmlns:wps="http://schemas.microsoft.com/office/word/2010/wordprocessingShape" mc:Ignorable="w14 w15 w16se w16cid w16 w16cex w16sdtdh w16sdtfl w16du wp14">
   <w:body>
     <w:p>
       <w:pPr>
@@ -68,21 +68,6 @@
         </w:rPr>
         <w:t>Contribution Summary</w:t>
       </w:r>
-    </w:p>
-    <w:p>
-      <w:pPr>
-        <w:spacing w:after="240" w:line="480" w:lineRule="auto"/>
-        <w:jc w:val="center"/>
-        <w:outlineLvl w:val="2"/>
-        <w:rPr>
-          <w:rFonts w:ascii="Times New Roman" w:eastAsia="Times New Roman" w:hAnsi="Times New Roman" w:cs="Times New Roman"/>
-          <w:b/>
-          <w:bCs/>
-          <w:color w:val="0F1115"/>
-          <w:kern w:val="0"/>
-          <w14:ligatures w14:val="none"/>
-        </w:rPr>
-      </w:pPr>
     </w:p>
     <w:p>
       <w:pPr>
@@ -283,23 +268,14 @@
         <w:shd w:val="clear" w:color="auto" w:fill="FFFFFF"/>
         <w:spacing w:before="0" w:beforeAutospacing="0" w:after="0" w:afterAutospacing="0" w:line="420" w:lineRule="atLeast"/>
         <w:rPr>
-          <w:rFonts w:ascii="Segoe UI" w:hAnsi="Segoe UI" w:cs="Segoe UI"/>
-          <w:color w:val="0F1115"/>
-        </w:rPr>
-      </w:pPr>
-      <w:r>
-        <w:rPr>
-          <w:rFonts w:ascii="Segoe UI" w:hAnsi="Segoe UI" w:cs="Segoe UI"/>
-          <w:color w:val="0F1115"/>
-        </w:rPr>
-        <w:t xml:space="preserve">Created a database script with 8 tables, including attributes, constraints, and </w:t>
-      </w:r>
-      <w:r>
-        <w:rPr>
-          <w:rFonts w:ascii="Segoe UI" w:hAnsi="Segoe UI" w:cs="Segoe UI"/>
-          <w:color w:val="0F1115"/>
-        </w:rPr>
-        <w:t>relationships.</w:t>
+          <w:color w:val="0F1115"/>
+        </w:rPr>
+      </w:pPr>
+      <w:r>
+        <w:rPr>
+          <w:color w:val="0F1115"/>
+        </w:rPr>
+        <w:t>Created a database script with 8 tables, including attributes, constraints, and relationships.</w:t>
       </w:r>
     </w:p>
     <w:p>
@@ -312,23 +288,14 @@
         <w:shd w:val="clear" w:color="auto" w:fill="FFFFFF"/>
         <w:spacing w:before="0" w:beforeAutospacing="0" w:after="0" w:afterAutospacing="0" w:line="420" w:lineRule="atLeast"/>
         <w:rPr>
-          <w:rFonts w:ascii="Segoe UI" w:hAnsi="Segoe UI" w:cs="Segoe UI"/>
-          <w:color w:val="0F1115"/>
-        </w:rPr>
-      </w:pPr>
-      <w:r>
-        <w:rPr>
-          <w:rFonts w:ascii="Segoe UI" w:hAnsi="Segoe UI" w:cs="Segoe UI"/>
-          <w:color w:val="0F1115"/>
-        </w:rPr>
-        <w:t xml:space="preserve">Met with Professor Weber to review and validate the database logic and </w:t>
-      </w:r>
-      <w:r>
-        <w:rPr>
-          <w:rFonts w:ascii="Segoe UI" w:hAnsi="Segoe UI" w:cs="Segoe UI"/>
-          <w:color w:val="0F1115"/>
-        </w:rPr>
-        <w:t>structure.</w:t>
+          <w:color w:val="0F1115"/>
+        </w:rPr>
+      </w:pPr>
+      <w:r>
+        <w:rPr>
+          <w:color w:val="0F1115"/>
+        </w:rPr>
+        <w:t>Met with Professor Weber to review and validate the database logic and structure.</w:t>
       </w:r>
     </w:p>
     <w:p>
@@ -341,37 +308,26 @@
         <w:shd w:val="clear" w:color="auto" w:fill="FFFFFF"/>
         <w:spacing w:before="0" w:beforeAutospacing="0" w:after="0" w:afterAutospacing="0" w:line="420" w:lineRule="atLeast"/>
         <w:rPr>
-          <w:rFonts w:ascii="Segoe UI" w:hAnsi="Segoe UI" w:cs="Segoe UI"/>
-          <w:color w:val="0F1115"/>
-        </w:rPr>
-      </w:pPr>
-      <w:r>
-        <w:rPr>
-          <w:rFonts w:ascii="Segoe UI" w:hAnsi="Segoe UI" w:cs="Segoe UI"/>
+          <w:color w:val="0F1115"/>
+        </w:rPr>
+      </w:pPr>
+      <w:r>
+        <w:rPr>
           <w:color w:val="0F1115"/>
         </w:rPr>
         <w:t xml:space="preserve">Prepared an acknowledgment document to recognize the assistance of Professor </w:t>
       </w:r>
       <w:r>
         <w:rPr>
-          <w:rFonts w:ascii="Segoe UI" w:hAnsi="Segoe UI" w:cs="Segoe UI"/>
-          <w:color w:val="0F1115"/>
-        </w:rPr>
-        <w:t>Dayu</w:t>
-      </w:r>
-      <w:r>
-        <w:rPr>
-          <w:rFonts w:ascii="Segoe UI" w:hAnsi="Segoe UI" w:cs="Segoe UI"/>
-          <w:color w:val="0F1115"/>
-        </w:rPr>
-        <w:t xml:space="preserve"> and Professor </w:t>
-      </w:r>
-      <w:r>
-        <w:rPr>
-          <w:rFonts w:ascii="Segoe UI" w:hAnsi="Segoe UI" w:cs="Segoe UI"/>
-          <w:color w:val="0F1115"/>
-        </w:rPr>
-        <w:t>Weber.</w:t>
+          <w:color w:val="0F1115"/>
+        </w:rPr>
+        <w:t>Wang</w:t>
+      </w:r>
+      <w:r>
+        <w:rPr>
+          <w:color w:val="0F1115"/>
+        </w:rPr>
+        <w:t xml:space="preserve"> and Professor Weber.</w:t>
       </w:r>
     </w:p>
     <w:p>
@@ -384,23 +340,14 @@
         <w:shd w:val="clear" w:color="auto" w:fill="FFFFFF"/>
         <w:spacing w:before="0" w:beforeAutospacing="0" w:after="0" w:afterAutospacing="0" w:line="420" w:lineRule="atLeast"/>
         <w:rPr>
-          <w:rFonts w:ascii="Segoe UI" w:hAnsi="Segoe UI" w:cs="Segoe UI"/>
-          <w:color w:val="0F1115"/>
-        </w:rPr>
-      </w:pPr>
-      <w:r>
-        <w:rPr>
-          <w:rFonts w:ascii="Segoe UI" w:hAnsi="Segoe UI" w:cs="Segoe UI"/>
-          <w:color w:val="0F1115"/>
-        </w:rPr>
-        <w:t>Developed logo inspirations and initial design concepts</w:t>
-      </w:r>
-      <w:r>
-        <w:rPr>
-          <w:rFonts w:ascii="Segoe UI" w:hAnsi="Segoe UI" w:cs="Segoe UI"/>
-          <w:color w:val="0F1115"/>
-        </w:rPr>
-        <w:t>.</w:t>
+          <w:color w:val="0F1115"/>
+        </w:rPr>
+      </w:pPr>
+      <w:r>
+        <w:rPr>
+          <w:color w:val="0F1115"/>
+        </w:rPr>
+        <w:t>Developed logo inspirations and initial design concepts.</w:t>
       </w:r>
     </w:p>
     <w:p>
@@ -413,13 +360,11 @@
         <w:shd w:val="clear" w:color="auto" w:fill="FFFFFF"/>
         <w:spacing w:before="0" w:beforeAutospacing="0" w:after="0" w:afterAutospacing="0" w:line="420" w:lineRule="atLeast"/>
         <w:rPr>
-          <w:rFonts w:ascii="Segoe UI" w:hAnsi="Segoe UI" w:cs="Segoe UI"/>
-          <w:color w:val="0F1115"/>
-        </w:rPr>
-      </w:pPr>
-      <w:r>
-        <w:rPr>
-          <w:rFonts w:ascii="Segoe UI" w:hAnsi="Segoe UI" w:cs="Segoe UI"/>
+          <w:color w:val="0F1115"/>
+        </w:rPr>
+      </w:pPr>
+      <w:r>
+        <w:rPr>
           <w:color w:val="0F1115"/>
         </w:rPr>
         <w:t>Created Flow Chart Document.</w:t>
@@ -435,93 +380,16 @@
         <w:shd w:val="clear" w:color="auto" w:fill="FFFFFF"/>
         <w:spacing w:before="0" w:beforeAutospacing="0" w:after="0" w:afterAutospacing="0" w:line="420" w:lineRule="atLeast"/>
         <w:rPr>
-          <w:rFonts w:ascii="Segoe UI" w:hAnsi="Segoe UI" w:cs="Segoe UI"/>
-          <w:color w:val="0F1115"/>
-        </w:rPr>
-      </w:pPr>
-      <w:r>
-        <w:rPr>
-          <w:rFonts w:ascii="Segoe UI" w:hAnsi="Segoe UI" w:cs="Segoe UI"/>
+          <w:color w:val="0F1115"/>
+        </w:rPr>
+      </w:pPr>
+      <w:r>
+        <w:rPr>
           <w:color w:val="0F1115"/>
           <w:shd w:val="clear" w:color="auto" w:fill="FFFFFF"/>
         </w:rPr>
-        <w:t xml:space="preserve">Created the content </w:t>
-      </w:r>
-      <w:r>
-        <w:rPr>
-          <w:rFonts w:ascii="Segoe UI" w:hAnsi="Segoe UI" w:cs="Segoe UI"/>
-          <w:color w:val="0F1115"/>
-          <w:shd w:val="clear" w:color="auto" w:fill="FFFFFF"/>
-        </w:rPr>
-        <w:t>of the</w:t>
-      </w:r>
-      <w:r>
-        <w:rPr>
-          <w:rFonts w:ascii="Segoe UI" w:hAnsi="Segoe UI" w:cs="Segoe UI"/>
-          <w:color w:val="0F1115"/>
-          <w:shd w:val="clear" w:color="auto" w:fill="FFFFFF"/>
-        </w:rPr>
-        <w:t xml:space="preserve"> backend </w:t>
-      </w:r>
-      <w:r>
-        <w:rPr>
-          <w:rFonts w:ascii="Segoe UI" w:hAnsi="Segoe UI" w:cs="Segoe UI"/>
-          <w:color w:val="0F1115"/>
-          <w:shd w:val="clear" w:color="auto" w:fill="FFFFFF"/>
-        </w:rPr>
-        <w:t>slides</w:t>
-      </w:r>
-      <w:r>
-        <w:rPr>
-          <w:rFonts w:ascii="Segoe UI" w:hAnsi="Segoe UI" w:cs="Segoe UI"/>
-          <w:color w:val="0F1115"/>
-          <w:shd w:val="clear" w:color="auto" w:fill="FFFFFF"/>
-        </w:rPr>
-        <w:t xml:space="preserve"> for the presentation</w:t>
-      </w:r>
-      <w:r>
-        <w:rPr>
-          <w:rFonts w:ascii="Segoe UI" w:hAnsi="Segoe UI" w:cs="Segoe UI"/>
-          <w:color w:val="0F1115"/>
-          <w:shd w:val="clear" w:color="auto" w:fill="FFFFFF"/>
-        </w:rPr>
-        <w:t>.</w:t>
-      </w:r>
-    </w:p>
-    <w:p>
-      <w:pPr>
-        <w:pStyle w:val="ds-markdown-paragraph"/>
-        <w:shd w:val="clear" w:color="auto" w:fill="FFFFFF"/>
-        <w:spacing w:before="0" w:beforeAutospacing="0" w:after="0" w:afterAutospacing="0" w:line="420" w:lineRule="atLeast"/>
-        <w:rPr>
-          <w:rFonts w:ascii="Segoe UI" w:hAnsi="Segoe UI" w:cs="Segoe UI"/>
-          <w:color w:val="0F1115"/>
-          <w:shd w:val="clear" w:color="auto" w:fill="FFFFFF"/>
-        </w:rPr>
-      </w:pPr>
-    </w:p>
-    <w:p>
-      <w:pPr>
-        <w:pStyle w:val="ds-markdown-paragraph"/>
-        <w:shd w:val="clear" w:color="auto" w:fill="FFFFFF"/>
-        <w:spacing w:before="0" w:beforeAutospacing="0" w:after="0" w:afterAutospacing="0" w:line="420" w:lineRule="atLeast"/>
-        <w:rPr>
-          <w:rFonts w:ascii="Segoe UI" w:hAnsi="Segoe UI" w:cs="Segoe UI"/>
-          <w:color w:val="0F1115"/>
-          <w:shd w:val="clear" w:color="auto" w:fill="FFFFFF"/>
-        </w:rPr>
-      </w:pPr>
-    </w:p>
-    <w:p>
-      <w:pPr>
-        <w:pStyle w:val="ds-markdown-paragraph"/>
-        <w:shd w:val="clear" w:color="auto" w:fill="FFFFFF"/>
-        <w:spacing w:before="0" w:beforeAutospacing="0" w:after="0" w:afterAutospacing="0" w:line="420" w:lineRule="atLeast"/>
-        <w:rPr>
-          <w:rFonts w:ascii="Segoe UI" w:hAnsi="Segoe UI" w:cs="Segoe UI"/>
-          <w:color w:val="0F1115"/>
-        </w:rPr>
-      </w:pPr>
+        <w:t>Created the content of the backend slides for the presentation.</w:t>
+      </w:r>
     </w:p>
     <w:p>
       <w:pPr>
@@ -561,8 +429,197 @@
           <w:kern w:val="0"/>
           <w14:ligatures w14:val="none"/>
         </w:rPr>
+        <w:t>Daniel Austin:</w:t>
+      </w:r>
+    </w:p>
+    <w:p>
+      <w:pPr>
+        <w:pStyle w:val="ListParagraph"/>
+        <w:numPr>
+          <w:ilvl w:val="0"/>
+          <w:numId w:val="4"/>
+        </w:numPr>
+        <w:spacing w:after="120" w:line="480" w:lineRule="auto"/>
+        <w:rPr>
+          <w:rFonts w:ascii="Times New Roman" w:eastAsia="Times New Roman" w:hAnsi="Times New Roman" w:cs="Times New Roman"/>
+          <w:b/>
+          <w:bCs/>
+          <w:color w:val="0F1115"/>
+          <w:kern w:val="0"/>
+          <w14:ligatures w14:val="none"/>
+        </w:rPr>
+      </w:pPr>
+      <w:r>
+        <w:rPr>
+          <w:rFonts w:ascii="Times New Roman" w:eastAsia="Times New Roman" w:hAnsi="Times New Roman" w:cs="Times New Roman"/>
+          <w:color w:val="0F1115"/>
+          <w:kern w:val="0"/>
+          <w14:ligatures w14:val="none"/>
+        </w:rPr>
+        <w:t>Created Dollar Doodle Gmail account</w:t>
+      </w:r>
+    </w:p>
+    <w:p>
+      <w:pPr>
+        <w:pStyle w:val="ListParagraph"/>
+        <w:numPr>
+          <w:ilvl w:val="0"/>
+          <w:numId w:val="4"/>
+        </w:numPr>
+        <w:spacing w:after="120" w:line="480" w:lineRule="auto"/>
+        <w:rPr>
+          <w:rFonts w:ascii="Times New Roman" w:eastAsia="Times New Roman" w:hAnsi="Times New Roman" w:cs="Times New Roman"/>
+          <w:b/>
+          <w:bCs/>
+          <w:color w:val="0F1115"/>
+          <w:kern w:val="0"/>
+          <w14:ligatures w14:val="none"/>
+        </w:rPr>
+      </w:pPr>
+      <w:r>
+        <w:rPr>
+          <w:rFonts w:ascii="Times New Roman" w:eastAsia="Times New Roman" w:hAnsi="Times New Roman" w:cs="Times New Roman"/>
+          <w:color w:val="0F1115"/>
+          <w:kern w:val="0"/>
+          <w14:ligatures w14:val="none"/>
+        </w:rPr>
+        <w:t>Created Google Dev Client ID</w:t>
+      </w:r>
+    </w:p>
+    <w:p>
+      <w:pPr>
+        <w:pStyle w:val="ListParagraph"/>
+        <w:numPr>
+          <w:ilvl w:val="0"/>
+          <w:numId w:val="4"/>
+        </w:numPr>
+        <w:spacing w:after="120" w:line="480" w:lineRule="auto"/>
+        <w:rPr>
+          <w:rFonts w:ascii="Times New Roman" w:eastAsia="Times New Roman" w:hAnsi="Times New Roman" w:cs="Times New Roman"/>
+          <w:b/>
+          <w:bCs/>
+          <w:color w:val="0F1115"/>
+          <w:kern w:val="0"/>
+          <w14:ligatures w14:val="none"/>
+        </w:rPr>
+      </w:pPr>
+      <w:r>
+        <w:rPr>
+          <w:rFonts w:ascii="Times New Roman" w:eastAsia="Times New Roman" w:hAnsi="Times New Roman" w:cs="Times New Roman"/>
+          <w:color w:val="0F1115"/>
+          <w:kern w:val="0"/>
+          <w14:ligatures w14:val="none"/>
+        </w:rPr>
+        <w:t>Formatted logo and added to home page</w:t>
+      </w:r>
+    </w:p>
+    <w:p>
+      <w:pPr>
+        <w:pStyle w:val="ListParagraph"/>
+        <w:numPr>
+          <w:ilvl w:val="0"/>
+          <w:numId w:val="4"/>
+        </w:numPr>
+        <w:spacing w:after="120" w:line="480" w:lineRule="auto"/>
+        <w:rPr>
+          <w:rFonts w:ascii="Times New Roman" w:eastAsia="Times New Roman" w:hAnsi="Times New Roman" w:cs="Times New Roman"/>
+          <w:b/>
+          <w:bCs/>
+          <w:color w:val="0F1115"/>
+          <w:kern w:val="0"/>
+          <w14:ligatures w14:val="none"/>
+        </w:rPr>
+      </w:pPr>
+      <w:r>
+        <w:rPr>
+          <w:rFonts w:ascii="Times New Roman" w:eastAsia="Times New Roman" w:hAnsi="Times New Roman" w:cs="Times New Roman"/>
+          <w:color w:val="0F1115"/>
+          <w:kern w:val="0"/>
+          <w14:ligatures w14:val="none"/>
+        </w:rPr>
         <w:lastRenderedPageBreak/>
-        <w:t>Daniel Austin:</w:t>
+        <w:t>Implemented Google Login API on home/login page</w:t>
+      </w:r>
+    </w:p>
+    <w:p>
+      <w:pPr>
+        <w:pStyle w:val="ListParagraph"/>
+        <w:numPr>
+          <w:ilvl w:val="0"/>
+          <w:numId w:val="4"/>
+        </w:numPr>
+        <w:spacing w:after="120" w:line="480" w:lineRule="auto"/>
+        <w:rPr>
+          <w:rFonts w:ascii="Times New Roman" w:eastAsia="Times New Roman" w:hAnsi="Times New Roman" w:cs="Times New Roman"/>
+          <w:b/>
+          <w:bCs/>
+          <w:color w:val="0F1115"/>
+          <w:kern w:val="0"/>
+          <w14:ligatures w14:val="none"/>
+        </w:rPr>
+      </w:pPr>
+      <w:r>
+        <w:rPr>
+          <w:rFonts w:ascii="Times New Roman" w:eastAsia="Times New Roman" w:hAnsi="Times New Roman" w:cs="Times New Roman"/>
+          <w:color w:val="0F1115"/>
+          <w:kern w:val="0"/>
+          <w14:ligatures w14:val="none"/>
+        </w:rPr>
+        <w:t>Developed Dollar Doodle logo inspirations and initial design concepts</w:t>
+      </w:r>
+    </w:p>
+    <w:p>
+      <w:pPr>
+        <w:pStyle w:val="ListParagraph"/>
+        <w:numPr>
+          <w:ilvl w:val="0"/>
+          <w:numId w:val="4"/>
+        </w:numPr>
+        <w:spacing w:after="120" w:line="480" w:lineRule="auto"/>
+        <w:rPr>
+          <w:rFonts w:ascii="Times New Roman" w:eastAsia="Times New Roman" w:hAnsi="Times New Roman" w:cs="Times New Roman"/>
+          <w:b/>
+          <w:bCs/>
+          <w:color w:val="0F1115"/>
+          <w:kern w:val="0"/>
+          <w14:ligatures w14:val="none"/>
+        </w:rPr>
+      </w:pPr>
+      <w:r>
+        <w:rPr>
+          <w:rFonts w:ascii="Times New Roman" w:eastAsia="Times New Roman" w:hAnsi="Times New Roman" w:cs="Times New Roman"/>
+          <w:color w:val="0F1115"/>
+          <w:kern w:val="0"/>
+          <w14:ligatures w14:val="none"/>
+        </w:rPr>
+        <w:t>Created content of the front-end slides for the Phase 2 presentation</w:t>
+      </w:r>
+    </w:p>
+    <w:p>
+      <w:pPr>
+        <w:pStyle w:val="ListParagraph"/>
+        <w:numPr>
+          <w:ilvl w:val="0"/>
+          <w:numId w:val="4"/>
+        </w:numPr>
+        <w:spacing w:after="120" w:line="480" w:lineRule="auto"/>
+        <w:rPr>
+          <w:rFonts w:ascii="Times New Roman" w:eastAsia="Times New Roman" w:hAnsi="Times New Roman" w:cs="Times New Roman"/>
+          <w:b/>
+          <w:bCs/>
+          <w:color w:val="0F1115"/>
+          <w:kern w:val="0"/>
+          <w14:ligatures w14:val="none"/>
+        </w:rPr>
+      </w:pPr>
+      <w:r>
+        <w:rPr>
+          <w:rFonts w:ascii="Times New Roman" w:eastAsia="Times New Roman" w:hAnsi="Times New Roman" w:cs="Times New Roman"/>
+          <w:color w:val="0F1115"/>
+          <w:kern w:val="0"/>
+          <w14:ligatures w14:val="none"/>
+        </w:rPr>
+        <w:t>Designed slide styles for the Phase 2 presentation</w:t>
       </w:r>
     </w:p>
     <w:p>
@@ -628,7 +685,7 @@
 </file>
 
 <file path=word/numbering.xml><?xml version="1.0" encoding="utf-8"?>
-<w:numbering xmlns:wpc="http://schemas.microsoft.com/office/word/2010/wordprocessingCanvas" xmlns:cx="http://schemas.microsoft.com/office/drawing/2014/chartex" xmlns:cx1="http://schemas.microsoft.com/office/drawing/2015/9/8/chartex" xmlns:cx2="http://schemas.microsoft.com/office/drawing/2015/10/21/chartex" xmlns:cx3="http://schemas.microsoft.com/office/drawing/2016/5/9/chartex" xmlns:cx4="http://schemas.microsoft.com/office/drawing/2016/5/10/chartex" xmlns:cx5="http://schemas.microsoft.com/office/drawing/2016/5/11/chartex" xmlns:cx6="http://schemas.microsoft.com/office/drawing/2016/5/12/chartex" xmlns:cx7="http://schemas.microsoft.com/office/drawing/2016/5/13/chartex" xmlns:cx8="http://schemas.microsoft.com/office/drawing/2016/5/14/chartex" xmlns:mc="http://schemas.openxmlformats.org/markup-compatibility/2006" xmlns:aink="http://schemas.microsoft.com/office/drawing/2016/ink" xmlns:am3d="http://schemas.microsoft.com/office/drawing/2017/model3d" xmlns:o="urn:schemas-microsoft-com:office:office" xmlns:oel="http://schemas.microsoft.com/office/2019/extlst" xmlns:r="http://schemas.openxmlformats.org/officeDocument/2006/relationships" xmlns:m="http://schemas.openxmlformats.org/officeDocument/2006/math" xmlns:v="urn:schemas-microsoft-com:vml" xmlns:wp14="http://schemas.microsoft.com/office/word/2010/wordprocessingDrawing" xmlns:wp="http://schemas.openxmlformats.org/drawingml/2006/wordprocessingDrawing" xmlns:w10="urn:schemas-microsoft-com:office:word" xmlns:w="http://schemas.openxmlformats.org/wordprocessingml/2006/main" xmlns:w14="http://schemas.microsoft.com/office/word/2010/wordml" xmlns:w15="http://schemas.microsoft.com/office/word/2012/wordml" xmlns:w16cex="http://schemas.microsoft.com/office/word/2018/wordml/cex" xmlns:w16cid="http://schemas.microsoft.com/office/word/2016/wordml/cid" xmlns:w16="http://schemas.microsoft.com/office/word/2018/wordml" xmlns:w16du="http://schemas.microsoft.com/office/word/2023/wordml/word16du" xmlns:w16sdtdh="http://schemas.microsoft.com/office/word/2020/wordml/sdtdatahash" xmlns:w16se="http://schemas.microsoft.com/office/word/2015/wordml/symex" xmlns:wpg="http://schemas.microsoft.com/office/word/2010/wordprocessingGroup" xmlns:wpi="http://schemas.microsoft.com/office/word/2010/wordprocessingInk" xmlns:wne="http://schemas.microsoft.com/office/word/2006/wordml" xmlns:wps="http://schemas.microsoft.com/office/word/2010/wordprocessingShape" mc:Ignorable="w14 w15 w16se w16cid w16 w16cex w16sdtdh w16du wp14">
+<w:numbering xmlns:wpc="http://schemas.microsoft.com/office/word/2010/wordprocessingCanvas" xmlns:cx="http://schemas.microsoft.com/office/drawing/2014/chartex" xmlns:cx1="http://schemas.microsoft.com/office/drawing/2015/9/8/chartex" xmlns:cx2="http://schemas.microsoft.com/office/drawing/2015/10/21/chartex" xmlns:cx3="http://schemas.microsoft.com/office/drawing/2016/5/9/chartex" xmlns:cx4="http://schemas.microsoft.com/office/drawing/2016/5/10/chartex" xmlns:cx5="http://schemas.microsoft.com/office/drawing/2016/5/11/chartex" xmlns:cx6="http://schemas.microsoft.com/office/drawing/2016/5/12/chartex" xmlns:cx7="http://schemas.microsoft.com/office/drawing/2016/5/13/chartex" xmlns:cx8="http://schemas.microsoft.com/office/drawing/2016/5/14/chartex" xmlns:mc="http://schemas.openxmlformats.org/markup-compatibility/2006" xmlns:aink="http://schemas.microsoft.com/office/drawing/2016/ink" xmlns:am3d="http://schemas.microsoft.com/office/drawing/2017/model3d" xmlns:o="urn:schemas-microsoft-com:office:office" xmlns:oel="http://schemas.microsoft.com/office/2019/extlst" xmlns:r="http://schemas.openxmlformats.org/officeDocument/2006/relationships" xmlns:m="http://schemas.openxmlformats.org/officeDocument/2006/math" xmlns:v="urn:schemas-microsoft-com:vml" xmlns:wp14="http://schemas.microsoft.com/office/word/2010/wordprocessingDrawing" xmlns:wp="http://schemas.openxmlformats.org/drawingml/2006/wordprocessingDrawing" xmlns:w10="urn:schemas-microsoft-com:office:word" xmlns:w="http://schemas.openxmlformats.org/wordprocessingml/2006/main" xmlns:w14="http://schemas.microsoft.com/office/word/2010/wordml" xmlns:w15="http://schemas.microsoft.com/office/word/2012/wordml" xmlns:w16cex="http://schemas.microsoft.com/office/word/2018/wordml/cex" xmlns:w16cid="http://schemas.microsoft.com/office/word/2016/wordml/cid" xmlns:w16="http://schemas.microsoft.com/office/word/2018/wordml" xmlns:w16du="http://schemas.microsoft.com/office/word/2023/wordml/word16du" xmlns:w16sdtdh="http://schemas.microsoft.com/office/word/2020/wordml/sdtdatahash" xmlns:w16sdtfl="http://schemas.microsoft.com/office/word/2024/wordml/sdtformatlock" xmlns:w16se="http://schemas.microsoft.com/office/word/2015/wordml/symex" xmlns:wpg="http://schemas.microsoft.com/office/word/2010/wordprocessingGroup" xmlns:wpi="http://schemas.microsoft.com/office/word/2010/wordprocessingInk" xmlns:wne="http://schemas.microsoft.com/office/word/2006/wordml" xmlns:wps="http://schemas.microsoft.com/office/word/2010/wordprocessingShape" mc:Ignorable="w14 w15 w16se w16cid w16 w16cex w16sdtdh w16sdtfl w16du wp14">
   <w:abstractNum w:abstractNumId="0" w15:restartNumberingAfterBreak="0">
     <w:nsid w:val="028134E2"/>
     <w:multiLevelType w:val="hybridMultilevel"/>
@@ -1167,7 +1224,7 @@
 </file>
 
 <file path=word/styles.xml><?xml version="1.0" encoding="utf-8"?>
-<w:styles xmlns:mc="http://schemas.openxmlformats.org/markup-compatibility/2006" xmlns:r="http://schemas.openxmlformats.org/officeDocument/2006/relationships" xmlns:w="http://schemas.openxmlformats.org/wordprocessingml/2006/main" xmlns:w14="http://schemas.microsoft.com/office/word/2010/wordml" xmlns:w15="http://schemas.microsoft.com/office/word/2012/wordml" xmlns:w16cex="http://schemas.microsoft.com/office/word/2018/wordml/cex" xmlns:w16cid="http://schemas.microsoft.com/office/word/2016/wordml/cid" xmlns:w16="http://schemas.microsoft.com/office/word/2018/wordml" xmlns:w16du="http://schemas.microsoft.com/office/word/2023/wordml/word16du" xmlns:w16sdtdh="http://schemas.microsoft.com/office/word/2020/wordml/sdtdatahash" xmlns:w16se="http://schemas.microsoft.com/office/word/2015/wordml/symex" mc:Ignorable="w14 w15 w16se w16cid w16 w16cex w16sdtdh w16du">
+<w:styles xmlns:mc="http://schemas.openxmlformats.org/markup-compatibility/2006" xmlns:r="http://schemas.openxmlformats.org/officeDocument/2006/relationships" xmlns:w="http://schemas.openxmlformats.org/wordprocessingml/2006/main" xmlns:w14="http://schemas.microsoft.com/office/word/2010/wordml" xmlns:w15="http://schemas.microsoft.com/office/word/2012/wordml" xmlns:w16cex="http://schemas.microsoft.com/office/word/2018/wordml/cex" xmlns:w16cid="http://schemas.microsoft.com/office/word/2016/wordml/cid" xmlns:w16="http://schemas.microsoft.com/office/word/2018/wordml" xmlns:w16du="http://schemas.microsoft.com/office/word/2023/wordml/word16du" xmlns:w16sdtdh="http://schemas.microsoft.com/office/word/2020/wordml/sdtdatahash" xmlns:w16sdtfl="http://schemas.microsoft.com/office/word/2024/wordml/sdtformatlock" xmlns:w16se="http://schemas.microsoft.com/office/word/2015/wordml/symex" mc:Ignorable="w14 w15 w16se w16cid w16 w16cex w16sdtdh w16sdtfl w16du">
   <w:docDefaults>
     <w:rPrDefault>
       <w:rPr>

</xml_diff>